<commit_message>
git commit -m "feat: align portfolio pages with updated resume"
</commit_message>
<xml_diff>
--- a/static/uploads/Isaac_Neibaur_resume.docx
+++ b/static/uploads/Isaac_Neibaur_resume.docx
@@ -17,35 +17,224 @@
           <w:sz w:val="22"/>
           <w:szCs w:val="22"/>
         </w:rPr>
-        <w:t xml:space="preserve">I serve as an analytical bridge between technical data systems and business decision-makers. By leveraging Power BI, Python automation, and SQL optimization, I transform raw operational data from platforms like Oracle and Databricks into clear performance metrics. As a DP-300 certified analyst pursuing </w:t>
-      </w:r>
-      <w:r>
-        <w:rPr>
-          <w:rFonts w:ascii="Calibri" w:hAnsi="Calibri" w:cs="Calibri"/>
-          <w:sz w:val="22"/>
-          <w:szCs w:val="22"/>
-        </w:rPr>
-        <w:t xml:space="preserve">DP-600 and 700 </w:t>
-      </w:r>
-      <w:r>
-        <w:rPr>
-          <w:rFonts w:ascii="Calibri" w:hAnsi="Calibri" w:cs="Calibri"/>
-          <w:sz w:val="22"/>
-          <w:szCs w:val="22"/>
-        </w:rPr>
-        <w:t>Fabric certifications, I combine technical rigor with a commitment to team growth and operational excellence</w:t>
-      </w:r>
-      <w:r>
-        <w:rPr>
-          <w:rFonts w:ascii="Calibri" w:hAnsi="Calibri" w:cs="Calibri"/>
-          <w:sz w:val="22"/>
-          <w:szCs w:val="22"/>
-        </w:rPr>
-        <w:t>.</w:t>
-      </w:r>
-    </w:p>
-    <w:p>
-      <w:pPr>
+        <w:t>Software Engineer and Data Platform Developer with experience building cloud automation, analytics platforms, APIs, and operational data solutions. Skilled in Python, SQL, Terraform, GitHub Actions, Power BI, Databricks, and Kubernetes with a focus on automation, reliability, and scalable data workflows. Combines enterprise leadership experience at General Motors with active independent engineering projects involving cloud infrastructure, CI/CD, Infrastructure as Code, and dashboard engineering.</w:t>
+      </w:r>
+    </w:p>
+    <w:p>
+      <w:pPr>
+        <w:spacing w:after="80"/>
+        <w:rPr>
+          <w:rFonts w:ascii="Calibri" w:hAnsi="Calibri" w:cs="Calibri"/>
+          <w:b/>
+          <w:bCs/>
+          <w:sz w:val="22"/>
+          <w:szCs w:val="22"/>
+        </w:rPr>
+        <w:sectPr>
+          <w:headerReference w:type="even" r:id="rId7"/>
+          <w:headerReference w:type="default" r:id="rId8"/>
+          <w:footerReference w:type="even" r:id="rId9"/>
+          <w:footerReference w:type="default" r:id="rId10"/>
+          <w:headerReference w:type="first" r:id="rId11"/>
+          <w:footerReference w:type="first" r:id="rId12"/>
+          <w:pgSz w:w="12240" w:h="15840"/>
+          <w:pgMar w:top="1440" w:right="1440" w:bottom="1440" w:left="1440" w:header="432" w:footer="720" w:gutter="0"/>
+          <w:cols w:space="720"/>
+          <w:docGrid w:linePitch="360"/>
+        </w:sectPr>
+      </w:pPr>
+    </w:p>
+    <w:p>
+      <w:pPr>
+        <w:spacing w:after="80"/>
+        <w:rPr>
+          <w:rFonts w:ascii="Calibri" w:hAnsi="Calibri" w:cs="Calibri"/>
+          <w:sz w:val="22"/>
+          <w:szCs w:val="22"/>
+        </w:rPr>
+      </w:pPr>
+      <w:r>
+        <w:rPr>
+          <w:rFonts w:ascii="Calibri" w:hAnsi="Calibri" w:cs="Calibri"/>
+          <w:b/>
+          <w:bCs/>
+          <w:sz w:val="22"/>
+          <w:szCs w:val="22"/>
+        </w:rPr>
+        <w:t>Languages &amp; Scripting</w:t>
+      </w:r>
+      <w:r>
+        <w:rPr>
+          <w:rFonts w:ascii="Calibri" w:hAnsi="Calibri" w:cs="Calibri"/>
+          <w:sz w:val="22"/>
+          <w:szCs w:val="22"/>
+        </w:rPr>
+        <w:t>: Python, SQL</w:t>
+      </w:r>
+    </w:p>
+    <w:p>
+      <w:pPr>
+        <w:spacing w:after="80"/>
+        <w:rPr>
+          <w:rFonts w:ascii="Calibri" w:hAnsi="Calibri" w:cs="Calibri"/>
+          <w:sz w:val="22"/>
+          <w:szCs w:val="22"/>
+        </w:rPr>
+      </w:pPr>
+      <w:r>
+        <w:rPr>
+          <w:rFonts w:ascii="Calibri" w:hAnsi="Calibri" w:cs="Calibri"/>
+          <w:b/>
+          <w:bCs/>
+          <w:sz w:val="22"/>
+          <w:szCs w:val="22"/>
+        </w:rPr>
+        <w:t>Cloud &amp; DevOps</w:t>
+      </w:r>
+      <w:r>
+        <w:rPr>
+          <w:rFonts w:ascii="Calibri" w:hAnsi="Calibri" w:cs="Calibri"/>
+          <w:sz w:val="22"/>
+          <w:szCs w:val="22"/>
+        </w:rPr>
+        <w:t>: Terraform, GitHub Actions, Docker, Kubernetes, Cloudflare, CI/CD</w:t>
+      </w:r>
+    </w:p>
+    <w:p>
+      <w:pPr>
+        <w:spacing w:after="80"/>
+        <w:rPr>
+          <w:rFonts w:ascii="Calibri" w:hAnsi="Calibri" w:cs="Calibri"/>
+          <w:sz w:val="22"/>
+          <w:szCs w:val="22"/>
+        </w:rPr>
+      </w:pPr>
+      <w:r>
+        <w:rPr>
+          <w:rFonts w:ascii="Calibri" w:hAnsi="Calibri" w:cs="Calibri"/>
+          <w:b/>
+          <w:bCs/>
+          <w:sz w:val="22"/>
+          <w:szCs w:val="22"/>
+        </w:rPr>
+        <w:t>Data &amp; Analytics</w:t>
+      </w:r>
+      <w:r>
+        <w:rPr>
+          <w:rFonts w:ascii="Calibri" w:hAnsi="Calibri" w:cs="Calibri"/>
+          <w:sz w:val="22"/>
+          <w:szCs w:val="22"/>
+        </w:rPr>
+        <w:t xml:space="preserve">: Power BI, Azure Databricks, PostgreSQL, </w:t>
+      </w:r>
+      <w:proofErr w:type="spellStart"/>
+      <w:r>
+        <w:rPr>
+          <w:rFonts w:ascii="Calibri" w:hAnsi="Calibri" w:cs="Calibri"/>
+          <w:sz w:val="22"/>
+          <w:szCs w:val="22"/>
+        </w:rPr>
+        <w:t>Supabase</w:t>
+      </w:r>
+      <w:proofErr w:type="spellEnd"/>
+      <w:r>
+        <w:rPr>
+          <w:rFonts w:ascii="Calibri" w:hAnsi="Calibri" w:cs="Calibri"/>
+          <w:sz w:val="22"/>
+          <w:szCs w:val="22"/>
+        </w:rPr>
+        <w:t>, ETL Pipelines, Dashboard Development</w:t>
+      </w:r>
+    </w:p>
+    <w:p>
+      <w:pPr>
+        <w:spacing w:after="80"/>
+        <w:rPr>
+          <w:rFonts w:ascii="Calibri" w:hAnsi="Calibri" w:cs="Calibri"/>
+          <w:sz w:val="22"/>
+          <w:szCs w:val="22"/>
+        </w:rPr>
+      </w:pPr>
+      <w:r>
+        <w:rPr>
+          <w:rFonts w:ascii="Calibri" w:hAnsi="Calibri" w:cs="Calibri"/>
+          <w:b/>
+          <w:bCs/>
+          <w:sz w:val="22"/>
+          <w:szCs w:val="22"/>
+        </w:rPr>
+        <w:t>Tools &amp; Platforms</w:t>
+      </w:r>
+      <w:r>
+        <w:rPr>
+          <w:rFonts w:ascii="Calibri" w:hAnsi="Calibri" w:cs="Calibri"/>
+          <w:sz w:val="22"/>
+          <w:szCs w:val="22"/>
+        </w:rPr>
+        <w:t>: Git, Jira, ServiceNow, Linux, Selenium, Postman, DataStage, Cognos, Tableau</w:t>
+      </w:r>
+    </w:p>
+    <w:p>
+      <w:pPr>
+        <w:spacing w:after="80"/>
+        <w:rPr>
+          <w:rFonts w:ascii="Calibri" w:hAnsi="Calibri" w:cs="Calibri"/>
+          <w:sz w:val="22"/>
+          <w:szCs w:val="22"/>
+        </w:rPr>
+      </w:pPr>
+      <w:r>
+        <w:rPr>
+          <w:rFonts w:ascii="Calibri" w:hAnsi="Calibri" w:cs="Calibri"/>
+          <w:b/>
+          <w:bCs/>
+          <w:sz w:val="22"/>
+          <w:szCs w:val="22"/>
+        </w:rPr>
+        <w:t>Concepts</w:t>
+      </w:r>
+      <w:r>
+        <w:rPr>
+          <w:rFonts w:ascii="Calibri" w:hAnsi="Calibri" w:cs="Calibri"/>
+          <w:sz w:val="22"/>
+          <w:szCs w:val="22"/>
+        </w:rPr>
+        <w:t>: REST APIs, Infrastructure as Code, Agile, Data Analytics</w:t>
+      </w:r>
+    </w:p>
+    <w:p>
+      <w:pPr>
+        <w:spacing w:after="80"/>
+        <w:rPr>
+          <w:rFonts w:ascii="Calibri" w:hAnsi="Calibri" w:cs="Calibri"/>
+          <w:sz w:val="22"/>
+          <w:szCs w:val="22"/>
+        </w:rPr>
+      </w:pPr>
+      <w:r>
+        <w:rPr>
+          <w:rFonts w:ascii="Calibri" w:hAnsi="Calibri" w:cs="Calibri"/>
+          <w:b/>
+          <w:bCs/>
+          <w:sz w:val="22"/>
+          <w:szCs w:val="22"/>
+        </w:rPr>
+        <w:t>Spoken Languages</w:t>
+      </w:r>
+      <w:r>
+        <w:rPr>
+          <w:rFonts w:ascii="Calibri" w:hAnsi="Calibri" w:cs="Calibri"/>
+          <w:sz w:val="22"/>
+          <w:szCs w:val="22"/>
+        </w:rPr>
+        <w:t>: Conversational Mandarin</w:t>
+      </w:r>
+    </w:p>
+    <w:p>
+      <w:pPr>
+        <w:tabs>
+          <w:tab w:val="right" w:pos="9360"/>
+        </w:tabs>
         <w:spacing w:after="0"/>
         <w:rPr>
           <w:rFonts w:ascii="Calibri" w:hAnsi="Calibri" w:cs="Calibri"/>
@@ -53,6 +242,26 @@
           <w:bCs/>
           <w:szCs w:val="24"/>
         </w:rPr>
+        <w:sectPr>
+          <w:type w:val="continuous"/>
+          <w:pgSz w:w="12240" w:h="15840"/>
+          <w:pgMar w:top="1440" w:right="1440" w:bottom="1440" w:left="1440" w:header="720" w:footer="720" w:gutter="0"/>
+          <w:cols w:num="2" w:space="720"/>
+          <w:docGrid w:linePitch="360"/>
+        </w:sectPr>
+      </w:pPr>
+    </w:p>
+    <w:p>
+      <w:pPr>
+        <w:tabs>
+          <w:tab w:val="right" w:pos="9360"/>
+        </w:tabs>
+        <w:spacing w:after="0"/>
+        <w:rPr>
+          <w:rFonts w:ascii="Calibri" w:hAnsi="Calibri" w:cs="Calibri"/>
+          <w:sz w:val="22"/>
+          <w:szCs w:val="22"/>
+        </w:rPr>
       </w:pPr>
       <w:r>
         <w:rPr>
@@ -61,7 +270,43 @@
           <w:bCs/>
           <w:szCs w:val="24"/>
         </w:rPr>
-        <w:t>Education</w:t>
+        <w:t>Independent Software &amp; Data Engineering Projects</w:t>
+      </w:r>
+      <w:r>
+        <w:rPr>
+          <w:rFonts w:ascii="Calibri" w:hAnsi="Calibri" w:cs="Calibri"/>
+          <w:szCs w:val="24"/>
+        </w:rPr>
+        <w:t xml:space="preserve"> </w:t>
+      </w:r>
+      <w:r>
+        <w:rPr>
+          <w:rFonts w:ascii="Calibri" w:hAnsi="Calibri" w:cs="Calibri"/>
+          <w:szCs w:val="24"/>
+        </w:rPr>
+        <w:tab/>
+      </w:r>
+      <w:r>
+        <w:rPr>
+          <w:rFonts w:ascii="Calibri" w:hAnsi="Calibri" w:cs="Calibri"/>
+          <w:szCs w:val="24"/>
+        </w:rPr>
+        <w:t>Jan</w:t>
+      </w:r>
+      <w:r>
+        <w:rPr>
+          <w:rFonts w:ascii="Calibri" w:hAnsi="Calibri" w:cs="Calibri"/>
+          <w:szCs w:val="24"/>
+        </w:rPr>
+        <w:t xml:space="preserve"> 2026</w:t>
+      </w:r>
+      <w:r>
+        <w:rPr>
+          <w:rFonts w:ascii="Calibri" w:hAnsi="Calibri" w:cs="Calibri"/>
+          <w:sz w:val="22"/>
+          <w:szCs w:val="22"/>
+        </w:rPr>
+        <w:t xml:space="preserve"> – Present</w:t>
       </w:r>
     </w:p>
     <w:p>
@@ -78,327 +323,8 @@
           <w:rFonts w:ascii="Calibri" w:hAnsi="Calibri" w:cs="Calibri"/>
           <w:sz w:val="22"/>
           <w:szCs w:val="22"/>
-          <w:u w:val="single"/>
-        </w:rPr>
-        <w:t>Oregon State University</w:t>
-      </w:r>
-      <w:r>
-        <w:rPr>
-          <w:rFonts w:ascii="Calibri" w:hAnsi="Calibri" w:cs="Calibri"/>
-          <w:sz w:val="22"/>
-          <w:szCs w:val="22"/>
-        </w:rPr>
-        <w:t xml:space="preserve"> Post-Baccalaureate Computer Science (3.91) </w:t>
-      </w:r>
-    </w:p>
-    <w:p>
-      <w:pPr>
-        <w:spacing w:after="80"/>
-        <w:rPr>
-          <w:rFonts w:ascii="Calibri" w:hAnsi="Calibri" w:cs="Calibri"/>
-          <w:sz w:val="22"/>
-          <w:szCs w:val="22"/>
-        </w:rPr>
-      </w:pPr>
-      <w:r>
-        <w:rPr>
-          <w:rFonts w:ascii="Calibri" w:hAnsi="Calibri" w:cs="Calibri"/>
-          <w:sz w:val="22"/>
-          <w:szCs w:val="22"/>
-          <w:u w:val="single"/>
-        </w:rPr>
-        <w:t>University of Florida</w:t>
-      </w:r>
-      <w:r>
-        <w:rPr>
-          <w:rFonts w:ascii="Calibri" w:hAnsi="Calibri" w:cs="Calibri"/>
-          <w:sz w:val="22"/>
-          <w:szCs w:val="22"/>
-        </w:rPr>
-        <w:t xml:space="preserve"> M.S. Agronomy (3.8); BS Botany; BA East Asian Languages &amp; Literature </w:t>
-      </w:r>
-      <w:r>
-        <w:rPr>
-          <w:rFonts w:ascii="Calibri" w:hAnsi="Calibri" w:cs="Calibri"/>
-          <w:sz w:val="22"/>
-          <w:szCs w:val="22"/>
-        </w:rPr>
-        <w:t xml:space="preserve">        </w:t>
-      </w:r>
-    </w:p>
-    <w:p>
-      <w:pPr>
-        <w:spacing w:after="0"/>
-        <w:rPr>
-          <w:rFonts w:ascii="Calibri" w:hAnsi="Calibri" w:cs="Calibri"/>
-          <w:sz w:val="22"/>
-          <w:szCs w:val="22"/>
-        </w:rPr>
-      </w:pPr>
-      <w:r>
-        <w:rPr>
-          <w:rFonts w:ascii="Calibri" w:hAnsi="Calibri" w:cs="Calibri"/>
-          <w:b/>
-          <w:bCs/>
-          <w:szCs w:val="24"/>
-        </w:rPr>
-        <w:t>General Motors</w:t>
-      </w:r>
-      <w:r>
-        <w:rPr>
-          <w:rFonts w:ascii="Calibri" w:hAnsi="Calibri" w:cs="Calibri"/>
-          <w:sz w:val="22"/>
-          <w:szCs w:val="22"/>
-        </w:rPr>
-        <w:t xml:space="preserve"> </w:t>
-      </w:r>
-      <w:r>
-        <w:rPr>
-          <w:rFonts w:ascii="Calibri" w:hAnsi="Calibri" w:cs="Calibri"/>
-          <w:sz w:val="22"/>
-          <w:szCs w:val="22"/>
-        </w:rPr>
-        <w:t xml:space="preserve">- Software Engineer (Operations &amp; Reliability) </w:t>
-      </w:r>
-      <w:r>
-        <w:rPr>
-          <w:rFonts w:ascii="Calibri" w:hAnsi="Calibri" w:cs="Calibri"/>
-          <w:sz w:val="22"/>
-          <w:szCs w:val="22"/>
-        </w:rPr>
-        <w:t xml:space="preserve">February 2021 – </w:t>
-      </w:r>
-      <w:r>
-        <w:rPr>
-          <w:rFonts w:ascii="Calibri" w:hAnsi="Calibri" w:cs="Calibri"/>
-          <w:sz w:val="22"/>
-          <w:szCs w:val="22"/>
-        </w:rPr>
-        <w:t>December 2025</w:t>
-      </w:r>
-    </w:p>
-    <w:p>
-      <w:pPr>
-        <w:pStyle w:val="ListParagraph"/>
-        <w:numPr>
-          <w:ilvl w:val="0"/>
-          <w:numId w:val="1"/>
-        </w:numPr>
-        <w:rPr>
-          <w:rFonts w:ascii="Calibri" w:hAnsi="Calibri" w:cs="Calibri"/>
-          <w:sz w:val="22"/>
-          <w:szCs w:val="22"/>
-        </w:rPr>
-      </w:pPr>
-      <w:r>
-        <w:rPr>
-          <w:rFonts w:ascii="Calibri" w:hAnsi="Calibri" w:cs="Calibri"/>
-          <w:sz w:val="22"/>
-          <w:szCs w:val="22"/>
-        </w:rPr>
-        <w:t>Served as a technical lead and analytical bridge for leadership, translating complex operational data from enterprise platforms into actionable insights for high-level stakeholders.</w:t>
-      </w:r>
-    </w:p>
-    <w:p>
-      <w:pPr>
-        <w:pStyle w:val="ListParagraph"/>
-        <w:numPr>
-          <w:ilvl w:val="0"/>
-          <w:numId w:val="1"/>
-        </w:numPr>
-        <w:rPr>
-          <w:rFonts w:ascii="Calibri" w:hAnsi="Calibri" w:cs="Calibri"/>
-          <w:sz w:val="22"/>
-          <w:szCs w:val="22"/>
-        </w:rPr>
-      </w:pPr>
-      <w:r>
-        <w:rPr>
-          <w:rFonts w:ascii="Calibri" w:hAnsi="Calibri" w:cs="Calibri"/>
-          <w:sz w:val="22"/>
-          <w:szCs w:val="22"/>
-        </w:rPr>
-        <w:t>Wrote and optimized SQL queries against large relational datasets</w:t>
-      </w:r>
-      <w:r>
-        <w:rPr>
-          <w:rFonts w:ascii="Calibri" w:hAnsi="Calibri" w:cs="Calibri"/>
-          <w:sz w:val="22"/>
-          <w:szCs w:val="22"/>
-        </w:rPr>
-        <w:t xml:space="preserve"> </w:t>
-      </w:r>
-      <w:r>
-        <w:rPr>
-          <w:rFonts w:ascii="Calibri" w:hAnsi="Calibri" w:cs="Calibri"/>
-          <w:sz w:val="22"/>
-          <w:szCs w:val="22"/>
-        </w:rPr>
-        <w:t>to support analytics, legacy reports, and end-user data extracts</w:t>
-      </w:r>
-      <w:r>
-        <w:rPr>
-          <w:rFonts w:ascii="Calibri" w:hAnsi="Calibri" w:cs="Calibri"/>
-          <w:sz w:val="22"/>
-          <w:szCs w:val="22"/>
-        </w:rPr>
-        <w:t xml:space="preserve"> from both Power BI and Microsoft Paginated </w:t>
-      </w:r>
-      <w:r>
-        <w:rPr>
-          <w:rFonts w:ascii="Calibri" w:hAnsi="Calibri" w:cs="Calibri"/>
-          <w:sz w:val="22"/>
-          <w:szCs w:val="22"/>
-        </w:rPr>
-        <w:t>Reports</w:t>
-      </w:r>
-      <w:r>
-        <w:rPr>
-          <w:rFonts w:ascii="Calibri" w:hAnsi="Calibri" w:cs="Calibri"/>
-          <w:sz w:val="22"/>
-          <w:szCs w:val="22"/>
-        </w:rPr>
-        <w:t>.</w:t>
-      </w:r>
-    </w:p>
-    <w:p>
-      <w:pPr>
-        <w:pStyle w:val="ListParagraph"/>
-        <w:numPr>
-          <w:ilvl w:val="0"/>
-          <w:numId w:val="1"/>
-        </w:numPr>
-        <w:rPr>
-          <w:rFonts w:ascii="Calibri" w:hAnsi="Calibri" w:cs="Calibri"/>
-          <w:sz w:val="22"/>
-          <w:szCs w:val="22"/>
-        </w:rPr>
-      </w:pPr>
-      <w:r>
-        <w:rPr>
-          <w:rFonts w:ascii="Calibri" w:hAnsi="Calibri" w:cs="Calibri"/>
-          <w:sz w:val="22"/>
-          <w:szCs w:val="22"/>
-        </w:rPr>
-        <w:t>Built Python</w:t>
-      </w:r>
-      <w:r>
-        <w:rPr>
-          <w:rFonts w:ascii="Calibri" w:hAnsi="Calibri" w:cs="Calibri"/>
-          <w:sz w:val="22"/>
-          <w:szCs w:val="22"/>
-        </w:rPr>
-        <w:t xml:space="preserve"> APIs and </w:t>
-      </w:r>
-      <w:r>
-        <w:rPr>
-          <w:rFonts w:ascii="Calibri" w:hAnsi="Calibri" w:cs="Calibri"/>
-          <w:sz w:val="22"/>
-          <w:szCs w:val="22"/>
-        </w:rPr>
-        <w:t xml:space="preserve">automation </w:t>
-      </w:r>
-      <w:r>
-        <w:rPr>
-          <w:rFonts w:ascii="Calibri" w:hAnsi="Calibri" w:cs="Calibri"/>
-          <w:sz w:val="22"/>
-          <w:szCs w:val="22"/>
-        </w:rPr>
-        <w:t xml:space="preserve">improving operational efficiency </w:t>
-      </w:r>
-      <w:r>
-        <w:rPr>
-          <w:rFonts w:ascii="Calibri" w:hAnsi="Calibri" w:cs="Calibri"/>
-          <w:sz w:val="22"/>
-          <w:szCs w:val="22"/>
-        </w:rPr>
-        <w:t>to refresh reports, and email scheduled report attachments</w:t>
-      </w:r>
-      <w:r>
-        <w:rPr>
-          <w:rFonts w:ascii="Calibri" w:hAnsi="Calibri" w:cs="Calibri"/>
-          <w:sz w:val="22"/>
-          <w:szCs w:val="22"/>
-        </w:rPr>
-        <w:t xml:space="preserve"> as well as pull Oracle data into a Cognos report</w:t>
-      </w:r>
-      <w:r>
-        <w:rPr>
-          <w:rFonts w:ascii="Calibri" w:hAnsi="Calibri" w:cs="Calibri"/>
-          <w:sz w:val="22"/>
-          <w:szCs w:val="22"/>
-        </w:rPr>
-        <w:t>.</w:t>
-      </w:r>
-    </w:p>
-    <w:p>
-      <w:pPr>
-        <w:pStyle w:val="ListParagraph"/>
-        <w:numPr>
-          <w:ilvl w:val="0"/>
-          <w:numId w:val="1"/>
-        </w:numPr>
-        <w:rPr>
-          <w:rFonts w:ascii="Calibri" w:hAnsi="Calibri" w:cs="Calibri"/>
-          <w:sz w:val="22"/>
-          <w:szCs w:val="22"/>
-        </w:rPr>
-      </w:pPr>
-      <w:r>
-        <w:rPr>
-          <w:rFonts w:ascii="Calibri" w:hAnsi="Calibri" w:cs="Calibri"/>
-          <w:sz w:val="22"/>
-          <w:szCs w:val="22"/>
-        </w:rPr>
-        <w:t>Orchestrated</w:t>
-      </w:r>
-      <w:r>
-        <w:rPr>
-          <w:rFonts w:ascii="Calibri" w:hAnsi="Calibri" w:cs="Calibri"/>
-          <w:sz w:val="22"/>
-          <w:szCs w:val="22"/>
-        </w:rPr>
-        <w:t xml:space="preserve"> and </w:t>
-      </w:r>
-      <w:r>
-        <w:rPr>
-          <w:rFonts w:ascii="Calibri" w:hAnsi="Calibri" w:cs="Calibri"/>
-          <w:sz w:val="22"/>
-          <w:szCs w:val="22"/>
-        </w:rPr>
-        <w:t>administered</w:t>
-      </w:r>
-      <w:r>
-        <w:rPr>
-          <w:rFonts w:ascii="Calibri" w:hAnsi="Calibri" w:cs="Calibri"/>
-          <w:sz w:val="22"/>
-          <w:szCs w:val="22"/>
-        </w:rPr>
-        <w:t xml:space="preserve"> </w:t>
-      </w:r>
-      <w:r>
-        <w:rPr>
-          <w:rFonts w:ascii="Calibri" w:hAnsi="Calibri" w:cs="Calibri"/>
-          <w:sz w:val="22"/>
-          <w:szCs w:val="22"/>
-        </w:rPr>
-        <w:t>reporting workflows using GitHub Actions</w:t>
-      </w:r>
-      <w:r>
-        <w:rPr>
-          <w:rFonts w:ascii="Calibri" w:hAnsi="Calibri" w:cs="Calibri"/>
-          <w:sz w:val="22"/>
-          <w:szCs w:val="22"/>
-        </w:rPr>
-        <w:t>, DataStage</w:t>
-      </w:r>
-      <w:r>
-        <w:rPr>
-          <w:rFonts w:ascii="Calibri" w:hAnsi="Calibri" w:cs="Calibri"/>
-          <w:sz w:val="22"/>
-          <w:szCs w:val="22"/>
-        </w:rPr>
-        <w:t xml:space="preserve"> and Azure Databricks, providing monitoring and recovery for automated data delivery.</w:t>
+        </w:rPr>
+        <w:t>Founder / Independent Engineer — 100DayDash &amp; Cloud Automation Projects</w:t>
       </w:r>
     </w:p>
     <w:p>
@@ -421,15 +347,7 @@
           <w:sz w:val="22"/>
           <w:szCs w:val="22"/>
         </w:rPr>
-        <w:t>Led the design and testing of advanced data models using star schema semantic modeling during a large-scale migration from Oracle to Azure Databricks</w:t>
-      </w:r>
-      <w:r>
-        <w:rPr>
-          <w:rFonts w:ascii="Calibri" w:hAnsi="Calibri" w:cs="Calibri"/>
-          <w:sz w:val="22"/>
-          <w:szCs w:val="22"/>
-        </w:rPr>
-        <w:t>.</w:t>
+        <w:t>Building and publicly documenting a 100-day engineering initiative focused on developing production-style dashboards, APIs, and cloud-native data platforms using real-world datasets.</w:t>
       </w:r>
     </w:p>
     <w:p>
@@ -452,59 +370,7 @@
           <w:sz w:val="22"/>
           <w:szCs w:val="22"/>
         </w:rPr>
-        <w:t xml:space="preserve">Led a two-year security-focused learning group covering DevOps security topics, including </w:t>
-      </w:r>
-      <w:proofErr w:type="spellStart"/>
-      <w:r>
-        <w:rPr>
-          <w:rFonts w:ascii="Calibri" w:hAnsi="Calibri" w:cs="Calibri"/>
-          <w:sz w:val="22"/>
-          <w:szCs w:val="22"/>
-        </w:rPr>
-        <w:t>PortSwigger</w:t>
-      </w:r>
-      <w:proofErr w:type="spellEnd"/>
-      <w:r>
-        <w:rPr>
-          <w:rFonts w:ascii="Calibri" w:hAnsi="Calibri" w:cs="Calibri"/>
-          <w:sz w:val="22"/>
-          <w:szCs w:val="22"/>
-        </w:rPr>
-        <w:t xml:space="preserve"> and </w:t>
-      </w:r>
-      <w:proofErr w:type="spellStart"/>
-      <w:r>
-        <w:rPr>
-          <w:rFonts w:ascii="Calibri" w:hAnsi="Calibri" w:cs="Calibri"/>
-          <w:sz w:val="22"/>
-          <w:szCs w:val="22"/>
-        </w:rPr>
-        <w:t>TryHackMe</w:t>
-      </w:r>
-      <w:proofErr w:type="spellEnd"/>
-      <w:r>
-        <w:rPr>
-          <w:rFonts w:ascii="Calibri" w:hAnsi="Calibri" w:cs="Calibri"/>
-          <w:sz w:val="22"/>
-          <w:szCs w:val="22"/>
-        </w:rPr>
-        <w:t xml:space="preserve"> labs, and participated </w:t>
-      </w:r>
-      <w:r>
-        <w:rPr>
-          <w:rFonts w:ascii="Calibri" w:hAnsi="Calibri" w:cs="Calibri"/>
-          <w:sz w:val="22"/>
-          <w:szCs w:val="22"/>
-        </w:rPr>
-        <w:t xml:space="preserve">and consistently ranked well </w:t>
-      </w:r>
-      <w:r>
-        <w:rPr>
-          <w:rFonts w:ascii="Calibri" w:hAnsi="Calibri" w:cs="Calibri"/>
-          <w:sz w:val="22"/>
-          <w:szCs w:val="22"/>
-        </w:rPr>
-        <w:t>in company-wide Secure Code Warrior competitions.</w:t>
+        <w:t>Developed a Cloudflare governance and remediation platform using Python, Terraform, GitHub Actions, and the Cloudflare API to audit domain security posture and optionally auto-remediate configuration drift.</w:t>
       </w:r>
     </w:p>
     <w:p>
@@ -527,7 +393,7 @@
           <w:sz w:val="22"/>
           <w:szCs w:val="22"/>
         </w:rPr>
-        <w:t>Led DEI training for my organization and was a small group lead promoting and celebrating Asian culture company wide, with monthly activities involving organizing speakers or leading sessions.</w:t>
+        <w:t>Implemented Infrastructure-as-Code workflows with Terraform and CI/CD pipelines using GitHub Actions, including automated validation, scheduled audits, and secure secret handling.</w:t>
       </w:r>
     </w:p>
     <w:p>
@@ -550,112 +416,61 @@
           <w:sz w:val="22"/>
           <w:szCs w:val="22"/>
         </w:rPr>
-        <w:t>Regularly competed and won company wide challenges including team hackathons and debates.</w:t>
-      </w:r>
-    </w:p>
-    <w:p>
-      <w:pPr>
-        <w:spacing w:after="0"/>
-        <w:rPr>
-          <w:rFonts w:ascii="Calibri" w:hAnsi="Calibri" w:cs="Calibri"/>
-          <w:sz w:val="22"/>
-          <w:szCs w:val="22"/>
-        </w:rPr>
-      </w:pPr>
-      <w:r>
-        <w:rPr>
-          <w:rFonts w:ascii="Calibri" w:hAnsi="Calibri" w:cs="Calibri"/>
-          <w:b/>
-          <w:bCs/>
-          <w:szCs w:val="24"/>
-        </w:rPr>
-        <w:t>Cabrillo Coastal General Insurance Agency</w:t>
-      </w:r>
-      <w:r>
-        <w:rPr>
-          <w:rFonts w:ascii="Calibri" w:hAnsi="Calibri" w:cs="Calibri"/>
-          <w:sz w:val="22"/>
-          <w:szCs w:val="22"/>
-        </w:rPr>
-        <w:t xml:space="preserve"> </w:t>
-      </w:r>
-      <w:r>
-        <w:rPr>
-          <w:rFonts w:ascii="Calibri" w:hAnsi="Calibri" w:cs="Calibri"/>
-          <w:sz w:val="22"/>
-          <w:szCs w:val="22"/>
-        </w:rPr>
-        <w:t xml:space="preserve">- </w:t>
-      </w:r>
-      <w:r>
-        <w:rPr>
-          <w:rFonts w:ascii="Calibri" w:hAnsi="Calibri" w:cs="Calibri"/>
-          <w:sz w:val="22"/>
-          <w:szCs w:val="22"/>
-        </w:rPr>
-        <w:t>Systems Analyst</w:t>
-      </w:r>
-      <w:r>
-        <w:rPr>
-          <w:rFonts w:ascii="Calibri" w:hAnsi="Calibri" w:cs="Calibri"/>
-          <w:sz w:val="22"/>
-          <w:szCs w:val="22"/>
-        </w:rPr>
-        <w:t xml:space="preserve"> </w:t>
-      </w:r>
-      <w:r>
-        <w:rPr>
-          <w:rFonts w:ascii="Calibri" w:hAnsi="Calibri" w:cs="Calibri"/>
-          <w:sz w:val="22"/>
-          <w:szCs w:val="22"/>
-        </w:rPr>
-        <w:t>June 2016 – January 2021</w:t>
-      </w:r>
-    </w:p>
-    <w:p>
-      <w:pPr>
-        <w:pStyle w:val="ListParagraph"/>
-        <w:numPr>
-          <w:ilvl w:val="0"/>
-          <w:numId w:val="1"/>
-        </w:numPr>
-        <w:rPr>
-          <w:rFonts w:ascii="Calibri" w:hAnsi="Calibri" w:cs="Calibri"/>
-          <w:sz w:val="22"/>
-          <w:szCs w:val="22"/>
-        </w:rPr>
-      </w:pPr>
-      <w:r>
-        <w:rPr>
-          <w:rFonts w:ascii="Calibri" w:hAnsi="Calibri" w:cs="Calibri"/>
-          <w:sz w:val="22"/>
-          <w:szCs w:val="22"/>
-        </w:rPr>
-        <w:t xml:space="preserve">Worked with </w:t>
-      </w:r>
-      <w:r>
-        <w:rPr>
-          <w:rFonts w:ascii="Calibri" w:hAnsi="Calibri" w:cs="Calibri"/>
-          <w:sz w:val="22"/>
-          <w:szCs w:val="22"/>
-        </w:rPr>
-        <w:t xml:space="preserve">a </w:t>
-      </w:r>
-      <w:r>
-        <w:rPr>
-          <w:rFonts w:ascii="Calibri" w:hAnsi="Calibri" w:cs="Calibri"/>
-          <w:sz w:val="22"/>
-          <w:szCs w:val="22"/>
-        </w:rPr>
-        <w:t>VP to build out and improve on our client facing phone tree as well as built dashboards and reports providing leadership insights into call volumes and other metrics</w:t>
-      </w:r>
-      <w:r>
-        <w:rPr>
-          <w:rFonts w:ascii="Calibri" w:hAnsi="Calibri" w:cs="Calibri"/>
-          <w:sz w:val="22"/>
-          <w:szCs w:val="22"/>
-        </w:rPr>
-        <w:t>.</w:t>
+        <w:t xml:space="preserve">Implemented modern repository governance and </w:t>
+      </w:r>
+      <w:proofErr w:type="spellStart"/>
+      <w:r>
+        <w:rPr>
+          <w:rFonts w:ascii="Calibri" w:hAnsi="Calibri" w:cs="Calibri"/>
+          <w:sz w:val="22"/>
+          <w:szCs w:val="22"/>
+        </w:rPr>
+        <w:t>DevSecOps</w:t>
+      </w:r>
+      <w:proofErr w:type="spellEnd"/>
+      <w:r>
+        <w:rPr>
+          <w:rFonts w:ascii="Calibri" w:hAnsi="Calibri" w:cs="Calibri"/>
+          <w:sz w:val="22"/>
+          <w:szCs w:val="22"/>
+        </w:rPr>
+        <w:t xml:space="preserve"> practices including automated validation pipelines, </w:t>
+      </w:r>
+      <w:proofErr w:type="spellStart"/>
+      <w:r>
+        <w:rPr>
+          <w:rFonts w:ascii="Calibri" w:hAnsi="Calibri" w:cs="Calibri"/>
+          <w:sz w:val="22"/>
+          <w:szCs w:val="22"/>
+        </w:rPr>
+        <w:t>Dependabot</w:t>
+      </w:r>
+      <w:proofErr w:type="spellEnd"/>
+      <w:r>
+        <w:rPr>
+          <w:rFonts w:ascii="Calibri" w:hAnsi="Calibri" w:cs="Calibri"/>
+          <w:sz w:val="22"/>
+          <w:szCs w:val="22"/>
+        </w:rPr>
+        <w:t xml:space="preserve">, </w:t>
+      </w:r>
+      <w:proofErr w:type="spellStart"/>
+      <w:r>
+        <w:rPr>
+          <w:rFonts w:ascii="Calibri" w:hAnsi="Calibri" w:cs="Calibri"/>
+          <w:sz w:val="22"/>
+          <w:szCs w:val="22"/>
+        </w:rPr>
+        <w:t>CodeQL</w:t>
+      </w:r>
+      <w:proofErr w:type="spellEnd"/>
+      <w:r>
+        <w:rPr>
+          <w:rFonts w:ascii="Calibri" w:hAnsi="Calibri" w:cs="Calibri"/>
+          <w:sz w:val="22"/>
+          <w:szCs w:val="22"/>
+        </w:rPr>
+        <w:t>, secret scanning, and branch protection workflows.</w:t>
       </w:r>
     </w:p>
     <w:p>
@@ -678,7 +493,25 @@
           <w:sz w:val="22"/>
           <w:szCs w:val="22"/>
         </w:rPr>
-        <w:t>On my own time, I built a solution to generate quotes via Postman and automated quote binding/testing using Python and Selenium.</w:t>
+        <w:t xml:space="preserve">Built validation and testing workflows using </w:t>
+      </w:r>
+      <w:proofErr w:type="spellStart"/>
+      <w:r>
+        <w:rPr>
+          <w:rFonts w:ascii="Calibri" w:hAnsi="Calibri" w:cs="Calibri"/>
+          <w:sz w:val="22"/>
+          <w:szCs w:val="22"/>
+        </w:rPr>
+        <w:t>pytest</w:t>
+      </w:r>
+      <w:proofErr w:type="spellEnd"/>
+      <w:r>
+        <w:rPr>
+          <w:rFonts w:ascii="Calibri" w:hAnsi="Calibri" w:cs="Calibri"/>
+          <w:sz w:val="22"/>
+          <w:szCs w:val="22"/>
+        </w:rPr>
+        <w:t>, linting, automated CI checks, and repository governance practices to improve deployment reliability and code quality.</w:t>
       </w:r>
     </w:p>
     <w:p>
@@ -701,242 +534,7 @@
           <w:sz w:val="22"/>
           <w:szCs w:val="22"/>
         </w:rPr>
-        <w:t xml:space="preserve">I was the contact </w:t>
-      </w:r>
-      <w:proofErr w:type="gramStart"/>
-      <w:r>
-        <w:rPr>
-          <w:rFonts w:ascii="Calibri" w:hAnsi="Calibri" w:cs="Calibri"/>
-          <w:sz w:val="22"/>
-          <w:szCs w:val="22"/>
-        </w:rPr>
-        <w:t>for</w:t>
-      </w:r>
-      <w:proofErr w:type="gramEnd"/>
-      <w:r>
-        <w:rPr>
-          <w:rFonts w:ascii="Calibri" w:hAnsi="Calibri" w:cs="Calibri"/>
-          <w:sz w:val="22"/>
-          <w:szCs w:val="22"/>
-        </w:rPr>
-        <w:t xml:space="preserve"> any questions regarding our </w:t>
-      </w:r>
-      <w:r>
-        <w:rPr>
-          <w:rFonts w:ascii="Calibri" w:hAnsi="Calibri" w:cs="Calibri"/>
-          <w:sz w:val="22"/>
-          <w:szCs w:val="22"/>
-        </w:rPr>
-        <w:t>company’s</w:t>
-      </w:r>
-      <w:r>
-        <w:rPr>
-          <w:rFonts w:ascii="Calibri" w:hAnsi="Calibri" w:cs="Calibri"/>
-          <w:sz w:val="22"/>
-          <w:szCs w:val="22"/>
-        </w:rPr>
-        <w:t xml:space="preserve"> new comparative rater API.</w:t>
-      </w:r>
-    </w:p>
-    <w:p>
-      <w:pPr>
-        <w:spacing w:after="0"/>
-        <w:rPr>
-          <w:rFonts w:ascii="Calibri" w:hAnsi="Calibri" w:cs="Calibri"/>
-          <w:sz w:val="22"/>
-          <w:szCs w:val="22"/>
-        </w:rPr>
-      </w:pPr>
-      <w:r>
-        <w:rPr>
-          <w:rFonts w:ascii="Calibri" w:hAnsi="Calibri" w:cs="Calibri"/>
-          <w:b/>
-          <w:bCs/>
-          <w:szCs w:val="24"/>
-        </w:rPr>
-        <w:t>Pioneer Hi-Bred</w:t>
-      </w:r>
-      <w:r>
-        <w:rPr>
-          <w:rFonts w:ascii="Calibri" w:hAnsi="Calibri" w:cs="Calibri"/>
-          <w:b/>
-          <w:bCs/>
-          <w:sz w:val="22"/>
-          <w:szCs w:val="22"/>
-        </w:rPr>
-        <w:t xml:space="preserve"> </w:t>
-      </w:r>
-      <w:r>
-        <w:rPr>
-          <w:rFonts w:ascii="Calibri" w:hAnsi="Calibri" w:cs="Calibri"/>
-          <w:sz w:val="22"/>
-          <w:szCs w:val="22"/>
-        </w:rPr>
-        <w:t xml:space="preserve">(Beijing, China) </w:t>
-      </w:r>
-      <w:r>
-        <w:rPr>
-          <w:rFonts w:ascii="Calibri" w:hAnsi="Calibri" w:cs="Calibri"/>
-          <w:sz w:val="22"/>
-          <w:szCs w:val="22"/>
-        </w:rPr>
-        <w:t xml:space="preserve">Senior Research </w:t>
-      </w:r>
-      <w:r>
-        <w:rPr>
-          <w:rFonts w:ascii="Calibri" w:hAnsi="Calibri" w:cs="Calibri"/>
-          <w:sz w:val="22"/>
-          <w:szCs w:val="22"/>
-        </w:rPr>
-        <w:t>Associate</w:t>
-      </w:r>
-      <w:r>
-        <w:rPr>
-          <w:rFonts w:ascii="Calibri" w:hAnsi="Calibri" w:cs="Calibri"/>
-          <w:sz w:val="22"/>
-          <w:szCs w:val="22"/>
-        </w:rPr>
-        <w:t xml:space="preserve"> June</w:t>
-      </w:r>
-      <w:r>
-        <w:rPr>
-          <w:rFonts w:ascii="Calibri" w:hAnsi="Calibri" w:cs="Calibri"/>
-          <w:sz w:val="22"/>
-          <w:szCs w:val="22"/>
-        </w:rPr>
-        <w:t xml:space="preserve"> 2013 – June 2015</w:t>
-      </w:r>
-    </w:p>
-    <w:p>
-      <w:pPr>
-        <w:pStyle w:val="ListParagraph"/>
-        <w:numPr>
-          <w:ilvl w:val="0"/>
-          <w:numId w:val="1"/>
-        </w:numPr>
-        <w:rPr>
-          <w:rFonts w:ascii="Calibri" w:hAnsi="Calibri" w:cs="Calibri"/>
-          <w:sz w:val="22"/>
-          <w:szCs w:val="22"/>
-        </w:rPr>
-      </w:pPr>
-      <w:r>
-        <w:rPr>
-          <w:rFonts w:ascii="Calibri" w:hAnsi="Calibri" w:cs="Calibri"/>
-          <w:sz w:val="22"/>
-          <w:szCs w:val="22"/>
-        </w:rPr>
-        <w:t xml:space="preserve">I was the </w:t>
-      </w:r>
-      <w:r>
-        <w:rPr>
-          <w:rFonts w:ascii="Calibri" w:hAnsi="Calibri" w:cs="Calibri"/>
-          <w:sz w:val="22"/>
-          <w:szCs w:val="22"/>
-        </w:rPr>
-        <w:t>main</w:t>
-      </w:r>
-      <w:r>
-        <w:rPr>
-          <w:rFonts w:ascii="Calibri" w:hAnsi="Calibri" w:cs="Calibri"/>
-          <w:sz w:val="22"/>
-          <w:szCs w:val="22"/>
-        </w:rPr>
-        <w:t xml:space="preserve"> contact between the US corporate office and </w:t>
-      </w:r>
-      <w:r>
-        <w:rPr>
-          <w:rFonts w:ascii="Calibri" w:hAnsi="Calibri" w:cs="Calibri"/>
-          <w:sz w:val="22"/>
-          <w:szCs w:val="22"/>
-        </w:rPr>
-        <w:t>researchers</w:t>
-      </w:r>
-      <w:r>
-        <w:rPr>
-          <w:rFonts w:ascii="Calibri" w:hAnsi="Calibri" w:cs="Calibri"/>
-          <w:sz w:val="22"/>
-          <w:szCs w:val="22"/>
-        </w:rPr>
-        <w:t xml:space="preserve"> in China and Australia</w:t>
-      </w:r>
-      <w:r>
-        <w:rPr>
-          <w:rFonts w:ascii="Calibri" w:hAnsi="Calibri" w:cs="Calibri"/>
-          <w:sz w:val="22"/>
-          <w:szCs w:val="22"/>
-        </w:rPr>
-        <w:t>.</w:t>
-      </w:r>
-    </w:p>
-    <w:p>
-      <w:pPr>
-        <w:pStyle w:val="ListParagraph"/>
-        <w:numPr>
-          <w:ilvl w:val="0"/>
-          <w:numId w:val="1"/>
-        </w:numPr>
-        <w:rPr>
-          <w:rFonts w:ascii="Calibri" w:hAnsi="Calibri" w:cs="Calibri"/>
-          <w:sz w:val="22"/>
-          <w:szCs w:val="22"/>
-        </w:rPr>
-      </w:pPr>
-      <w:r>
-        <w:rPr>
-          <w:rFonts w:ascii="Calibri" w:hAnsi="Calibri" w:cs="Calibri"/>
-          <w:sz w:val="22"/>
-          <w:szCs w:val="22"/>
-        </w:rPr>
-        <w:t>I customized and</w:t>
-      </w:r>
-      <w:r>
-        <w:rPr>
-          <w:rFonts w:ascii="Calibri" w:hAnsi="Calibri" w:cs="Calibri"/>
-          <w:sz w:val="22"/>
-          <w:szCs w:val="22"/>
-        </w:rPr>
-        <w:t xml:space="preserve"> deployed </w:t>
-      </w:r>
-      <w:r>
-        <w:rPr>
-          <w:rFonts w:ascii="Calibri" w:hAnsi="Calibri" w:cs="Calibri"/>
-          <w:sz w:val="22"/>
-          <w:szCs w:val="22"/>
-        </w:rPr>
-        <w:t>automated</w:t>
-      </w:r>
-      <w:r>
-        <w:rPr>
-          <w:rFonts w:ascii="Calibri" w:hAnsi="Calibri" w:cs="Calibri"/>
-          <w:sz w:val="22"/>
-          <w:szCs w:val="22"/>
-        </w:rPr>
-        <w:t xml:space="preserve"> labeling and tracking solutions</w:t>
-      </w:r>
-      <w:r>
-        <w:rPr>
-          <w:rFonts w:ascii="Calibri" w:hAnsi="Calibri" w:cs="Calibri"/>
-          <w:sz w:val="22"/>
-          <w:szCs w:val="22"/>
-        </w:rPr>
-        <w:t xml:space="preserve"> that researchers could use to print barcode labels for their petri dishes vs the original </w:t>
-      </w:r>
-      <w:r>
-        <w:rPr>
-          <w:rFonts w:ascii="Calibri" w:hAnsi="Calibri" w:cs="Calibri"/>
-          <w:sz w:val="22"/>
-          <w:szCs w:val="22"/>
-        </w:rPr>
-        <w:t>manual Excel-based process</w:t>
-      </w:r>
-      <w:r>
-        <w:rPr>
-          <w:rFonts w:ascii="Calibri" w:hAnsi="Calibri" w:cs="Calibri"/>
-          <w:sz w:val="22"/>
-          <w:szCs w:val="22"/>
-        </w:rPr>
-        <w:t>.</w:t>
+        <w:t>Designed portfolio and dashboard platforms hosted through GitHub Pages and Cloudflare, including automated deployments, custom domain management, HTTPS, DNS, and observability tooling.</w:t>
       </w:r>
     </w:p>
     <w:p>
@@ -959,7 +557,43 @@
           <w:sz w:val="22"/>
           <w:szCs w:val="22"/>
         </w:rPr>
-        <w:t>I provided software training to the different research sites and helped users troubleshoot issues</w:t>
+        <w:t xml:space="preserve">Designing reusable data engineering workflows involving APIs, ETL pipelines, medallion-style </w:t>
+      </w:r>
+      <w:proofErr w:type="gramStart"/>
+      <w:r>
+        <w:rPr>
+          <w:rFonts w:ascii="Calibri" w:hAnsi="Calibri" w:cs="Calibri"/>
+          <w:sz w:val="22"/>
+          <w:szCs w:val="22"/>
+        </w:rPr>
+        <w:t>architectures</w:t>
+      </w:r>
+      <w:proofErr w:type="gramEnd"/>
+      <w:r>
+        <w:rPr>
+          <w:rFonts w:ascii="Calibri" w:hAnsi="Calibri" w:cs="Calibri"/>
+          <w:sz w:val="22"/>
+          <w:szCs w:val="22"/>
+        </w:rPr>
+        <w:t xml:space="preserve">, </w:t>
+      </w:r>
+      <w:proofErr w:type="spellStart"/>
+      <w:r>
+        <w:rPr>
+          <w:rFonts w:ascii="Calibri" w:hAnsi="Calibri" w:cs="Calibri"/>
+          <w:sz w:val="22"/>
+          <w:szCs w:val="22"/>
+        </w:rPr>
+        <w:t>Supabase</w:t>
+      </w:r>
+      <w:proofErr w:type="spellEnd"/>
+      <w:r>
+        <w:rPr>
+          <w:rFonts w:ascii="Calibri" w:hAnsi="Calibri" w:cs="Calibri"/>
+          <w:sz w:val="22"/>
+          <w:szCs w:val="22"/>
+        </w:rPr>
+        <w:t>, PostgreSQL, and dashboard integrations</w:t>
       </w:r>
       <w:r>
         <w:rPr>
@@ -968,69 +602,6 @@
           <w:szCs w:val="22"/>
         </w:rPr>
         <w:t>.</w:t>
-      </w:r>
-    </w:p>
-    <w:p>
-      <w:pPr>
-        <w:spacing w:after="0"/>
-        <w:rPr>
-          <w:rFonts w:ascii="Calibri" w:hAnsi="Calibri" w:cs="Calibri"/>
-          <w:b/>
-          <w:bCs/>
-          <w:sz w:val="22"/>
-          <w:szCs w:val="22"/>
-        </w:rPr>
-      </w:pPr>
-      <w:r>
-        <w:rPr>
-          <w:rFonts w:ascii="Calibri" w:hAnsi="Calibri" w:cs="Calibri"/>
-          <w:b/>
-          <w:bCs/>
-          <w:szCs w:val="24"/>
-        </w:rPr>
-        <w:t>Pioneer Hi-Bred</w:t>
-      </w:r>
-      <w:r>
-        <w:rPr>
-          <w:rFonts w:ascii="Calibri" w:hAnsi="Calibri" w:cs="Calibri"/>
-          <w:b/>
-          <w:bCs/>
-          <w:sz w:val="22"/>
-          <w:szCs w:val="22"/>
-        </w:rPr>
-        <w:t xml:space="preserve"> </w:t>
-      </w:r>
-      <w:r>
-        <w:rPr>
-          <w:rFonts w:ascii="Calibri" w:hAnsi="Calibri" w:cs="Calibri"/>
-          <w:sz w:val="22"/>
-          <w:szCs w:val="22"/>
-        </w:rPr>
-        <w:t xml:space="preserve">- </w:t>
-      </w:r>
-      <w:r>
-        <w:rPr>
-          <w:rFonts w:ascii="Calibri" w:hAnsi="Calibri" w:cs="Calibri"/>
-          <w:sz w:val="22"/>
-          <w:szCs w:val="22"/>
-        </w:rPr>
-        <w:t>Research Associate</w:t>
-      </w:r>
-      <w:r>
-        <w:rPr>
-          <w:rFonts w:ascii="Calibri" w:hAnsi="Calibri" w:cs="Calibri"/>
-          <w:sz w:val="22"/>
-          <w:szCs w:val="22"/>
-        </w:rPr>
-        <w:t xml:space="preserve"> </w:t>
-      </w:r>
-      <w:r>
-        <w:rPr>
-          <w:rFonts w:ascii="Calibri" w:hAnsi="Calibri" w:cs="Calibri"/>
-          <w:sz w:val="22"/>
-          <w:szCs w:val="22"/>
-        </w:rPr>
-        <w:t>January 2008 – May 2013</w:t>
       </w:r>
     </w:p>
     <w:p>
@@ -1053,23 +624,30 @@
           <w:sz w:val="22"/>
           <w:szCs w:val="22"/>
         </w:rPr>
-        <w:t>I d</w:t>
-      </w:r>
-      <w:r>
-        <w:rPr>
-          <w:rFonts w:ascii="Calibri" w:hAnsi="Calibri" w:cs="Calibri"/>
-          <w:sz w:val="22"/>
-          <w:szCs w:val="22"/>
-        </w:rPr>
-        <w:t>esigned and implemented a custom environmental monitoring system using sensors to track humidity, temperature, and light conditions</w:t>
-      </w:r>
-      <w:r>
-        <w:rPr>
-          <w:rFonts w:ascii="Calibri" w:hAnsi="Calibri" w:cs="Calibri"/>
-          <w:sz w:val="22"/>
-          <w:szCs w:val="22"/>
-        </w:rPr>
-        <w:t xml:space="preserve"> and feed this into a Spotfire dashboard</w:t>
+        <w:t>Developing public technical documentation and engineering blogs at 100daydash.blog covering platform engineering, cloud infrastructure, automation, analytics, and software development practices.</w:t>
+      </w:r>
+    </w:p>
+    <w:p>
+      <w:pPr>
+        <w:pStyle w:val="ListParagraph"/>
+        <w:numPr>
+          <w:ilvl w:val="0"/>
+          <w:numId w:val="1"/>
+        </w:numPr>
+        <w:spacing w:after="80"/>
+        <w:rPr>
+          <w:rFonts w:ascii="Calibri" w:hAnsi="Calibri" w:cs="Calibri"/>
+          <w:sz w:val="22"/>
+          <w:szCs w:val="22"/>
+        </w:rPr>
+      </w:pPr>
+      <w:r>
+        <w:rPr>
+          <w:rFonts w:ascii="Calibri" w:hAnsi="Calibri" w:cs="Calibri"/>
+          <w:sz w:val="22"/>
+          <w:szCs w:val="22"/>
+        </w:rPr>
+        <w:t>Developing dashboards and visualization solutions using Power BI, Looker Studio, Astro, Hugo, and Python-based visualization frameworks</w:t>
       </w:r>
       <w:r>
         <w:rPr>
@@ -1080,13 +658,1008 @@
         <w:t>.</w:t>
       </w:r>
     </w:p>
+    <w:p>
+      <w:pPr>
+        <w:tabs>
+          <w:tab w:val="right" w:pos="9360"/>
+        </w:tabs>
+        <w:spacing w:after="0"/>
+        <w:rPr>
+          <w:rFonts w:ascii="Calibri" w:hAnsi="Calibri" w:cs="Calibri"/>
+          <w:sz w:val="22"/>
+          <w:szCs w:val="22"/>
+        </w:rPr>
+      </w:pPr>
+      <w:r>
+        <w:rPr>
+          <w:rFonts w:ascii="Calibri" w:hAnsi="Calibri" w:cs="Calibri"/>
+          <w:b/>
+          <w:bCs/>
+          <w:szCs w:val="24"/>
+        </w:rPr>
+        <w:t>General Motors</w:t>
+      </w:r>
+      <w:r>
+        <w:rPr>
+          <w:rFonts w:ascii="Calibri" w:hAnsi="Calibri" w:cs="Calibri"/>
+          <w:sz w:val="22"/>
+          <w:szCs w:val="22"/>
+        </w:rPr>
+        <w:t xml:space="preserve"> </w:t>
+      </w:r>
+      <w:r>
+        <w:rPr>
+          <w:rFonts w:ascii="Calibri" w:hAnsi="Calibri" w:cs="Calibri"/>
+          <w:sz w:val="22"/>
+          <w:szCs w:val="22"/>
+        </w:rPr>
+        <w:t xml:space="preserve">- Software Engineer (Operations &amp; Reliability) </w:t>
+      </w:r>
+      <w:r>
+        <w:rPr>
+          <w:rFonts w:ascii="Calibri" w:hAnsi="Calibri" w:cs="Calibri"/>
+          <w:sz w:val="22"/>
+          <w:szCs w:val="22"/>
+        </w:rPr>
+        <w:tab/>
+      </w:r>
+      <w:r>
+        <w:rPr>
+          <w:rFonts w:ascii="Calibri" w:hAnsi="Calibri" w:cs="Calibri"/>
+          <w:sz w:val="22"/>
+          <w:szCs w:val="22"/>
+        </w:rPr>
+        <w:t>Feb</w:t>
+      </w:r>
+      <w:r>
+        <w:rPr>
+          <w:rFonts w:ascii="Calibri" w:hAnsi="Calibri" w:cs="Calibri"/>
+          <w:sz w:val="22"/>
+          <w:szCs w:val="22"/>
+        </w:rPr>
+        <w:t xml:space="preserve"> 2021 – </w:t>
+      </w:r>
+      <w:r>
+        <w:rPr>
+          <w:rFonts w:ascii="Calibri" w:hAnsi="Calibri" w:cs="Calibri"/>
+          <w:sz w:val="22"/>
+          <w:szCs w:val="22"/>
+        </w:rPr>
+        <w:t>Dec</w:t>
+      </w:r>
+      <w:r>
+        <w:rPr>
+          <w:rFonts w:ascii="Calibri" w:hAnsi="Calibri" w:cs="Calibri"/>
+          <w:sz w:val="22"/>
+          <w:szCs w:val="22"/>
+        </w:rPr>
+        <w:t xml:space="preserve"> 2025</w:t>
+      </w:r>
+    </w:p>
+    <w:p>
+      <w:pPr>
+        <w:pStyle w:val="ListParagraph"/>
+        <w:numPr>
+          <w:ilvl w:val="0"/>
+          <w:numId w:val="1"/>
+        </w:numPr>
+        <w:rPr>
+          <w:rFonts w:ascii="Calibri" w:hAnsi="Calibri" w:cs="Calibri"/>
+          <w:sz w:val="22"/>
+          <w:szCs w:val="22"/>
+        </w:rPr>
+      </w:pPr>
+      <w:r>
+        <w:rPr>
+          <w:rFonts w:ascii="Calibri" w:hAnsi="Calibri" w:cs="Calibri"/>
+          <w:sz w:val="22"/>
+          <w:szCs w:val="22"/>
+        </w:rPr>
+        <w:t>IT Product owner and Technical Lead</w:t>
+      </w:r>
+      <w:r>
+        <w:rPr>
+          <w:rFonts w:ascii="Calibri" w:hAnsi="Calibri" w:cs="Calibri"/>
+          <w:sz w:val="22"/>
+          <w:szCs w:val="22"/>
+        </w:rPr>
+        <w:t>, translating complex operational data from enterprise platforms into actionable insights for high-level stakeholders.</w:t>
+      </w:r>
+    </w:p>
+    <w:p>
+      <w:pPr>
+        <w:pStyle w:val="ListParagraph"/>
+        <w:numPr>
+          <w:ilvl w:val="0"/>
+          <w:numId w:val="1"/>
+        </w:numPr>
+        <w:rPr>
+          <w:rFonts w:ascii="Calibri" w:hAnsi="Calibri" w:cs="Calibri"/>
+          <w:sz w:val="22"/>
+          <w:szCs w:val="22"/>
+        </w:rPr>
+      </w:pPr>
+      <w:r>
+        <w:rPr>
+          <w:rFonts w:ascii="Calibri" w:hAnsi="Calibri" w:cs="Calibri"/>
+          <w:sz w:val="22"/>
+          <w:szCs w:val="22"/>
+        </w:rPr>
+        <w:t>Wrote and optimized SQL queries against large relational datasets</w:t>
+      </w:r>
+      <w:r>
+        <w:rPr>
+          <w:rFonts w:ascii="Calibri" w:hAnsi="Calibri" w:cs="Calibri"/>
+          <w:sz w:val="22"/>
+          <w:szCs w:val="22"/>
+        </w:rPr>
+        <w:t xml:space="preserve"> </w:t>
+      </w:r>
+      <w:r>
+        <w:rPr>
+          <w:rFonts w:ascii="Calibri" w:hAnsi="Calibri" w:cs="Calibri"/>
+          <w:sz w:val="22"/>
+          <w:szCs w:val="22"/>
+        </w:rPr>
+        <w:t>to support analytics, legacy reports, and end-user data extracts</w:t>
+      </w:r>
+      <w:r>
+        <w:rPr>
+          <w:rFonts w:ascii="Calibri" w:hAnsi="Calibri" w:cs="Calibri"/>
+          <w:sz w:val="22"/>
+          <w:szCs w:val="22"/>
+        </w:rPr>
+        <w:t xml:space="preserve"> from both Power BI and Microsoft Paginated Reports</w:t>
+      </w:r>
+      <w:r>
+        <w:rPr>
+          <w:rFonts w:ascii="Calibri" w:hAnsi="Calibri" w:cs="Calibri"/>
+          <w:sz w:val="22"/>
+          <w:szCs w:val="22"/>
+        </w:rPr>
+        <w:t>.</w:t>
+      </w:r>
+    </w:p>
+    <w:p>
+      <w:pPr>
+        <w:pStyle w:val="ListParagraph"/>
+        <w:numPr>
+          <w:ilvl w:val="0"/>
+          <w:numId w:val="1"/>
+        </w:numPr>
+        <w:rPr>
+          <w:rFonts w:ascii="Calibri" w:hAnsi="Calibri" w:cs="Calibri"/>
+          <w:sz w:val="22"/>
+          <w:szCs w:val="22"/>
+        </w:rPr>
+      </w:pPr>
+      <w:r>
+        <w:rPr>
+          <w:rFonts w:ascii="Calibri" w:hAnsi="Calibri" w:cs="Calibri"/>
+          <w:sz w:val="22"/>
+          <w:szCs w:val="22"/>
+        </w:rPr>
+        <w:lastRenderedPageBreak/>
+        <w:t>Developed Python APIs and automation workflows integrating Oracle, Cognos, Power BI, and scheduled reporting systems, significantly reducing manual operational effort.</w:t>
+      </w:r>
+    </w:p>
+    <w:p>
+      <w:pPr>
+        <w:pStyle w:val="ListParagraph"/>
+        <w:numPr>
+          <w:ilvl w:val="0"/>
+          <w:numId w:val="1"/>
+        </w:numPr>
+        <w:rPr>
+          <w:rFonts w:ascii="Calibri" w:hAnsi="Calibri" w:cs="Calibri"/>
+          <w:sz w:val="22"/>
+          <w:szCs w:val="22"/>
+        </w:rPr>
+      </w:pPr>
+      <w:r>
+        <w:rPr>
+          <w:rFonts w:ascii="Calibri" w:hAnsi="Calibri" w:cs="Calibri"/>
+          <w:sz w:val="22"/>
+          <w:szCs w:val="22"/>
+        </w:rPr>
+        <w:t>Managed automated enterprise reporting pipelines using GitHub Actions, Azure Databricks, and DataStage with monitoring, recovery, and operational support processes.</w:t>
+      </w:r>
+    </w:p>
+    <w:p>
+      <w:pPr>
+        <w:pStyle w:val="ListParagraph"/>
+        <w:numPr>
+          <w:ilvl w:val="0"/>
+          <w:numId w:val="1"/>
+        </w:numPr>
+        <w:spacing w:after="80"/>
+        <w:rPr>
+          <w:rFonts w:ascii="Calibri" w:hAnsi="Calibri" w:cs="Calibri"/>
+          <w:sz w:val="22"/>
+          <w:szCs w:val="22"/>
+        </w:rPr>
+      </w:pPr>
+      <w:r>
+        <w:rPr>
+          <w:rFonts w:ascii="Calibri" w:hAnsi="Calibri" w:cs="Calibri"/>
+          <w:sz w:val="22"/>
+          <w:szCs w:val="22"/>
+        </w:rPr>
+        <w:t>Prioritized technical debt, operational reliability improvements, and stakeholder requirements within Agile sprint planning processes.</w:t>
+      </w:r>
+    </w:p>
+    <w:p>
+      <w:pPr>
+        <w:pStyle w:val="ListParagraph"/>
+        <w:numPr>
+          <w:ilvl w:val="0"/>
+          <w:numId w:val="1"/>
+        </w:numPr>
+        <w:spacing w:after="80"/>
+        <w:rPr>
+          <w:rFonts w:ascii="Calibri" w:hAnsi="Calibri" w:cs="Calibri"/>
+          <w:sz w:val="22"/>
+          <w:szCs w:val="22"/>
+        </w:rPr>
+      </w:pPr>
+      <w:r>
+        <w:rPr>
+          <w:rFonts w:ascii="Calibri" w:hAnsi="Calibri" w:cs="Calibri"/>
+          <w:sz w:val="22"/>
+          <w:szCs w:val="22"/>
+        </w:rPr>
+        <w:t>Led cross-functional technical learning and employee engagement initiatives involving cybersecurity labs, mentoring, and company-wide collaboration activities.</w:t>
+      </w:r>
+    </w:p>
+    <w:p>
+      <w:pPr>
+        <w:tabs>
+          <w:tab w:val="right" w:pos="9360"/>
+        </w:tabs>
+        <w:spacing w:after="0"/>
+        <w:rPr>
+          <w:rFonts w:ascii="Calibri" w:hAnsi="Calibri" w:cs="Calibri"/>
+          <w:sz w:val="22"/>
+          <w:szCs w:val="22"/>
+        </w:rPr>
+      </w:pPr>
+      <w:r>
+        <w:rPr>
+          <w:rFonts w:ascii="Calibri" w:hAnsi="Calibri" w:cs="Calibri"/>
+          <w:b/>
+          <w:bCs/>
+          <w:szCs w:val="24"/>
+        </w:rPr>
+        <w:t>Cabrillo Coastal General Insurance Agency</w:t>
+      </w:r>
+      <w:r>
+        <w:rPr>
+          <w:rFonts w:ascii="Calibri" w:hAnsi="Calibri" w:cs="Calibri"/>
+          <w:sz w:val="22"/>
+          <w:szCs w:val="22"/>
+        </w:rPr>
+        <w:t xml:space="preserve"> </w:t>
+      </w:r>
+      <w:r>
+        <w:rPr>
+          <w:rFonts w:ascii="Calibri" w:hAnsi="Calibri" w:cs="Calibri"/>
+          <w:sz w:val="22"/>
+          <w:szCs w:val="22"/>
+        </w:rPr>
+        <w:t xml:space="preserve">- </w:t>
+      </w:r>
+      <w:r>
+        <w:rPr>
+          <w:rFonts w:ascii="Calibri" w:hAnsi="Calibri" w:cs="Calibri"/>
+          <w:sz w:val="22"/>
+          <w:szCs w:val="22"/>
+        </w:rPr>
+        <w:t xml:space="preserve">Systems Analyst </w:t>
+      </w:r>
+      <w:r>
+        <w:rPr>
+          <w:rFonts w:ascii="Calibri" w:hAnsi="Calibri" w:cs="Calibri"/>
+          <w:sz w:val="22"/>
+          <w:szCs w:val="22"/>
+        </w:rPr>
+        <w:tab/>
+      </w:r>
+      <w:r>
+        <w:rPr>
+          <w:rFonts w:ascii="Calibri" w:hAnsi="Calibri" w:cs="Calibri"/>
+          <w:sz w:val="22"/>
+          <w:szCs w:val="22"/>
+        </w:rPr>
+        <w:t>Jun</w:t>
+      </w:r>
+      <w:r>
+        <w:rPr>
+          <w:rFonts w:ascii="Calibri" w:hAnsi="Calibri" w:cs="Calibri"/>
+          <w:sz w:val="22"/>
+          <w:szCs w:val="22"/>
+        </w:rPr>
+        <w:t xml:space="preserve"> 2016 – </w:t>
+      </w:r>
+      <w:r>
+        <w:rPr>
+          <w:rFonts w:ascii="Calibri" w:hAnsi="Calibri" w:cs="Calibri"/>
+          <w:sz w:val="22"/>
+          <w:szCs w:val="22"/>
+        </w:rPr>
+        <w:t>Jan</w:t>
+      </w:r>
+      <w:r>
+        <w:rPr>
+          <w:rFonts w:ascii="Calibri" w:hAnsi="Calibri" w:cs="Calibri"/>
+          <w:sz w:val="22"/>
+          <w:szCs w:val="22"/>
+        </w:rPr>
+        <w:t xml:space="preserve"> 2021</w:t>
+      </w:r>
+    </w:p>
+    <w:p>
+      <w:pPr>
+        <w:pStyle w:val="ListParagraph"/>
+        <w:numPr>
+          <w:ilvl w:val="0"/>
+          <w:numId w:val="1"/>
+        </w:numPr>
+        <w:rPr>
+          <w:rFonts w:ascii="Calibri" w:hAnsi="Calibri" w:cs="Calibri"/>
+          <w:sz w:val="22"/>
+          <w:szCs w:val="22"/>
+        </w:rPr>
+      </w:pPr>
+      <w:r>
+        <w:rPr>
+          <w:rFonts w:ascii="Calibri" w:hAnsi="Calibri" w:cs="Calibri"/>
+          <w:sz w:val="22"/>
+          <w:szCs w:val="22"/>
+        </w:rPr>
+        <w:t xml:space="preserve">Worked with VP to build out and improve on our client facing phone tree as well as </w:t>
+      </w:r>
+      <w:proofErr w:type="gramStart"/>
+      <w:r>
+        <w:rPr>
+          <w:rFonts w:ascii="Calibri" w:hAnsi="Calibri" w:cs="Calibri"/>
+          <w:sz w:val="22"/>
+          <w:szCs w:val="22"/>
+        </w:rPr>
+        <w:t>built</w:t>
+      </w:r>
+      <w:proofErr w:type="gramEnd"/>
+      <w:r>
+        <w:rPr>
+          <w:rFonts w:ascii="Calibri" w:hAnsi="Calibri" w:cs="Calibri"/>
+          <w:sz w:val="22"/>
+          <w:szCs w:val="22"/>
+        </w:rPr>
+        <w:t xml:space="preserve"> dashboards and reports providing leadership insights into call volumes and other metrics</w:t>
+      </w:r>
+      <w:r>
+        <w:rPr>
+          <w:rFonts w:ascii="Calibri" w:hAnsi="Calibri" w:cs="Calibri"/>
+          <w:sz w:val="22"/>
+          <w:szCs w:val="22"/>
+        </w:rPr>
+        <w:t>.</w:t>
+      </w:r>
+    </w:p>
+    <w:p>
+      <w:pPr>
+        <w:pStyle w:val="ListParagraph"/>
+        <w:numPr>
+          <w:ilvl w:val="0"/>
+          <w:numId w:val="1"/>
+        </w:numPr>
+        <w:spacing w:after="80"/>
+        <w:rPr>
+          <w:rFonts w:ascii="Calibri" w:hAnsi="Calibri" w:cs="Calibri"/>
+          <w:sz w:val="22"/>
+          <w:szCs w:val="22"/>
+        </w:rPr>
+      </w:pPr>
+      <w:r>
+        <w:rPr>
+          <w:rFonts w:ascii="Calibri" w:hAnsi="Calibri" w:cs="Calibri"/>
+          <w:sz w:val="22"/>
+          <w:szCs w:val="22"/>
+        </w:rPr>
+        <w:t>Independently d</w:t>
+      </w:r>
+      <w:r>
+        <w:rPr>
+          <w:rFonts w:ascii="Calibri" w:hAnsi="Calibri" w:cs="Calibri"/>
+          <w:sz w:val="22"/>
+          <w:szCs w:val="22"/>
+        </w:rPr>
+        <w:t>eveloped automation tooling using Postman, Python, and Selenium to generate, bind, and validate insurance quotes for testing and operational efficiency</w:t>
+      </w:r>
+      <w:r>
+        <w:rPr>
+          <w:rFonts w:ascii="Calibri" w:hAnsi="Calibri" w:cs="Calibri"/>
+          <w:sz w:val="22"/>
+          <w:szCs w:val="22"/>
+        </w:rPr>
+        <w:t>.</w:t>
+      </w:r>
+    </w:p>
+    <w:p>
+      <w:pPr>
+        <w:pStyle w:val="ListParagraph"/>
+        <w:numPr>
+          <w:ilvl w:val="0"/>
+          <w:numId w:val="1"/>
+        </w:numPr>
+        <w:spacing w:after="80"/>
+        <w:rPr>
+          <w:rFonts w:ascii="Calibri" w:hAnsi="Calibri" w:cs="Calibri"/>
+          <w:sz w:val="22"/>
+          <w:szCs w:val="22"/>
+        </w:rPr>
+      </w:pPr>
+      <w:r>
+        <w:rPr>
+          <w:rFonts w:ascii="Calibri" w:hAnsi="Calibri" w:cs="Calibri"/>
+          <w:sz w:val="22"/>
+          <w:szCs w:val="22"/>
+        </w:rPr>
+        <w:t>Served as primary technical contact for the company’s comparative rater API integration</w:t>
+      </w:r>
+      <w:r>
+        <w:rPr>
+          <w:rFonts w:ascii="Calibri" w:hAnsi="Calibri" w:cs="Calibri"/>
+          <w:sz w:val="22"/>
+          <w:szCs w:val="22"/>
+        </w:rPr>
+        <w:t>.</w:t>
+      </w:r>
+    </w:p>
+    <w:p>
+      <w:pPr>
+        <w:tabs>
+          <w:tab w:val="right" w:pos="9360"/>
+        </w:tabs>
+        <w:spacing w:after="0"/>
+        <w:rPr>
+          <w:rFonts w:ascii="Calibri" w:hAnsi="Calibri" w:cs="Calibri"/>
+          <w:sz w:val="22"/>
+          <w:szCs w:val="22"/>
+        </w:rPr>
+      </w:pPr>
+      <w:r>
+        <w:rPr>
+          <w:rFonts w:ascii="Calibri" w:hAnsi="Calibri" w:cs="Calibri"/>
+          <w:b/>
+          <w:bCs/>
+          <w:szCs w:val="24"/>
+        </w:rPr>
+        <w:t>Pioneer Hi-Bred</w:t>
+      </w:r>
+      <w:r>
+        <w:rPr>
+          <w:rFonts w:ascii="Calibri" w:hAnsi="Calibri" w:cs="Calibri"/>
+          <w:b/>
+          <w:bCs/>
+          <w:sz w:val="22"/>
+          <w:szCs w:val="22"/>
+        </w:rPr>
+        <w:t xml:space="preserve"> </w:t>
+      </w:r>
+      <w:r>
+        <w:rPr>
+          <w:rFonts w:ascii="Calibri" w:hAnsi="Calibri" w:cs="Calibri"/>
+          <w:sz w:val="22"/>
+          <w:szCs w:val="22"/>
+        </w:rPr>
+        <w:t xml:space="preserve">(Beijing, China) </w:t>
+      </w:r>
+      <w:r>
+        <w:rPr>
+          <w:rFonts w:ascii="Calibri" w:hAnsi="Calibri" w:cs="Calibri"/>
+          <w:sz w:val="22"/>
+          <w:szCs w:val="22"/>
+        </w:rPr>
+        <w:t xml:space="preserve">Senior Research </w:t>
+      </w:r>
+      <w:r>
+        <w:rPr>
+          <w:rFonts w:ascii="Calibri" w:hAnsi="Calibri" w:cs="Calibri"/>
+          <w:sz w:val="22"/>
+          <w:szCs w:val="22"/>
+        </w:rPr>
+        <w:t xml:space="preserve">Associate </w:t>
+      </w:r>
+      <w:r>
+        <w:rPr>
+          <w:rFonts w:ascii="Calibri" w:hAnsi="Calibri" w:cs="Calibri"/>
+          <w:sz w:val="22"/>
+          <w:szCs w:val="22"/>
+        </w:rPr>
+        <w:tab/>
+      </w:r>
+      <w:r>
+        <w:rPr>
+          <w:rFonts w:ascii="Calibri" w:hAnsi="Calibri" w:cs="Calibri"/>
+          <w:sz w:val="22"/>
+          <w:szCs w:val="22"/>
+        </w:rPr>
+        <w:t>Jun</w:t>
+      </w:r>
+      <w:r>
+        <w:rPr>
+          <w:rFonts w:ascii="Calibri" w:hAnsi="Calibri" w:cs="Calibri"/>
+          <w:sz w:val="22"/>
+          <w:szCs w:val="22"/>
+        </w:rPr>
+        <w:t xml:space="preserve"> 2013 – </w:t>
+      </w:r>
+      <w:r>
+        <w:rPr>
+          <w:rFonts w:ascii="Calibri" w:hAnsi="Calibri" w:cs="Calibri"/>
+          <w:sz w:val="22"/>
+          <w:szCs w:val="22"/>
+        </w:rPr>
+        <w:t>Jun</w:t>
+      </w:r>
+      <w:r>
+        <w:rPr>
+          <w:rFonts w:ascii="Calibri" w:hAnsi="Calibri" w:cs="Calibri"/>
+          <w:sz w:val="22"/>
+          <w:szCs w:val="22"/>
+        </w:rPr>
+        <w:t xml:space="preserve"> 2015</w:t>
+      </w:r>
+    </w:p>
+    <w:p>
+      <w:pPr>
+        <w:pStyle w:val="ListParagraph"/>
+        <w:numPr>
+          <w:ilvl w:val="0"/>
+          <w:numId w:val="1"/>
+        </w:numPr>
+        <w:spacing w:after="80"/>
+        <w:rPr>
+          <w:rFonts w:ascii="Calibri" w:hAnsi="Calibri" w:cs="Calibri"/>
+          <w:sz w:val="22"/>
+          <w:szCs w:val="22"/>
+        </w:rPr>
+      </w:pPr>
+      <w:r>
+        <w:rPr>
+          <w:rFonts w:ascii="Calibri" w:hAnsi="Calibri" w:cs="Calibri"/>
+          <w:sz w:val="22"/>
+          <w:szCs w:val="22"/>
+        </w:rPr>
+        <w:t>Served as primary liaison between U.S., China, and Australia research teams.</w:t>
+      </w:r>
+    </w:p>
+    <w:p>
+      <w:pPr>
+        <w:pStyle w:val="ListParagraph"/>
+        <w:numPr>
+          <w:ilvl w:val="0"/>
+          <w:numId w:val="1"/>
+        </w:numPr>
+        <w:spacing w:after="80"/>
+        <w:rPr>
+          <w:rFonts w:ascii="Calibri" w:hAnsi="Calibri" w:cs="Calibri"/>
+          <w:sz w:val="22"/>
+          <w:szCs w:val="22"/>
+        </w:rPr>
+      </w:pPr>
+      <w:r>
+        <w:rPr>
+          <w:rFonts w:ascii="Calibri" w:hAnsi="Calibri" w:cs="Calibri"/>
+          <w:sz w:val="22"/>
+          <w:szCs w:val="22"/>
+        </w:rPr>
+        <w:t>Developed barcode labeling and tracking solutions replacing manual Excel-based workflows.</w:t>
+      </w:r>
+    </w:p>
+    <w:p>
+      <w:pPr>
+        <w:pStyle w:val="ListParagraph"/>
+        <w:numPr>
+          <w:ilvl w:val="0"/>
+          <w:numId w:val="1"/>
+        </w:numPr>
+        <w:spacing w:after="80"/>
+        <w:rPr>
+          <w:rFonts w:ascii="Calibri" w:hAnsi="Calibri" w:cs="Calibri"/>
+          <w:sz w:val="22"/>
+          <w:szCs w:val="22"/>
+        </w:rPr>
+      </w:pPr>
+      <w:r>
+        <w:rPr>
+          <w:rFonts w:ascii="Calibri" w:hAnsi="Calibri" w:cs="Calibri"/>
+          <w:sz w:val="22"/>
+          <w:szCs w:val="22"/>
+        </w:rPr>
+        <w:t>Delivered software training and technical support across research sites.</w:t>
+      </w:r>
+    </w:p>
+    <w:p>
+      <w:pPr>
+        <w:tabs>
+          <w:tab w:val="right" w:pos="9360"/>
+        </w:tabs>
+        <w:spacing w:after="0"/>
+        <w:rPr>
+          <w:rFonts w:ascii="Calibri" w:hAnsi="Calibri" w:cs="Calibri"/>
+          <w:b/>
+          <w:bCs/>
+          <w:sz w:val="22"/>
+          <w:szCs w:val="22"/>
+        </w:rPr>
+      </w:pPr>
+      <w:r>
+        <w:rPr>
+          <w:rFonts w:ascii="Calibri" w:hAnsi="Calibri" w:cs="Calibri"/>
+          <w:b/>
+          <w:bCs/>
+          <w:szCs w:val="24"/>
+        </w:rPr>
+        <w:t>Pioneer Hi-Bred</w:t>
+      </w:r>
+      <w:r>
+        <w:rPr>
+          <w:rFonts w:ascii="Calibri" w:hAnsi="Calibri" w:cs="Calibri"/>
+          <w:b/>
+          <w:bCs/>
+          <w:sz w:val="22"/>
+          <w:szCs w:val="22"/>
+        </w:rPr>
+        <w:t xml:space="preserve"> </w:t>
+      </w:r>
+      <w:r>
+        <w:rPr>
+          <w:rFonts w:ascii="Calibri" w:hAnsi="Calibri" w:cs="Calibri"/>
+          <w:sz w:val="22"/>
+          <w:szCs w:val="22"/>
+        </w:rPr>
+        <w:t xml:space="preserve">- </w:t>
+      </w:r>
+      <w:r>
+        <w:rPr>
+          <w:rFonts w:ascii="Calibri" w:hAnsi="Calibri" w:cs="Calibri"/>
+          <w:sz w:val="22"/>
+          <w:szCs w:val="22"/>
+        </w:rPr>
+        <w:t xml:space="preserve">Research Associate </w:t>
+      </w:r>
+      <w:r>
+        <w:rPr>
+          <w:rFonts w:ascii="Calibri" w:hAnsi="Calibri" w:cs="Calibri"/>
+          <w:sz w:val="22"/>
+          <w:szCs w:val="22"/>
+        </w:rPr>
+        <w:tab/>
+      </w:r>
+      <w:r>
+        <w:rPr>
+          <w:rFonts w:ascii="Calibri" w:hAnsi="Calibri" w:cs="Calibri"/>
+          <w:sz w:val="22"/>
+          <w:szCs w:val="22"/>
+        </w:rPr>
+        <w:t>Jan</w:t>
+      </w:r>
+      <w:r>
+        <w:rPr>
+          <w:rFonts w:ascii="Calibri" w:hAnsi="Calibri" w:cs="Calibri"/>
+          <w:sz w:val="22"/>
+          <w:szCs w:val="22"/>
+        </w:rPr>
+        <w:t xml:space="preserve"> 2008 – May 2013</w:t>
+      </w:r>
+    </w:p>
+    <w:p>
+      <w:pPr>
+        <w:pStyle w:val="ListParagraph"/>
+        <w:numPr>
+          <w:ilvl w:val="0"/>
+          <w:numId w:val="1"/>
+        </w:numPr>
+        <w:spacing w:after="240"/>
+        <w:rPr>
+          <w:rFonts w:ascii="Calibri" w:hAnsi="Calibri" w:cs="Calibri"/>
+          <w:sz w:val="22"/>
+          <w:szCs w:val="22"/>
+        </w:rPr>
+      </w:pPr>
+      <w:r>
+        <w:rPr>
+          <w:rFonts w:ascii="Calibri" w:hAnsi="Calibri" w:cs="Calibri"/>
+          <w:sz w:val="22"/>
+          <w:szCs w:val="22"/>
+        </w:rPr>
+        <w:t>Designed and implemented an environmental monitoring system integrating sensor data into Spotfire dashboards for operational analysis</w:t>
+      </w:r>
+      <w:r>
+        <w:rPr>
+          <w:rFonts w:ascii="Calibri" w:hAnsi="Calibri" w:cs="Calibri"/>
+          <w:sz w:val="22"/>
+          <w:szCs w:val="22"/>
+        </w:rPr>
+        <w:t>.</w:t>
+      </w:r>
+    </w:p>
+    <w:p>
+      <w:pPr>
+        <w:tabs>
+          <w:tab w:val="left" w:pos="8565"/>
+        </w:tabs>
+        <w:spacing w:after="0"/>
+        <w:jc w:val="center"/>
+        <w:rPr>
+          <w:rFonts w:ascii="Calibri" w:hAnsi="Calibri" w:cs="Calibri"/>
+          <w:b/>
+          <w:bCs/>
+          <w:szCs w:val="24"/>
+        </w:rPr>
+      </w:pPr>
+      <w:r>
+        <w:rPr>
+          <w:rFonts w:ascii="Calibri" w:hAnsi="Calibri" w:cs="Calibri"/>
+          <w:b/>
+          <w:bCs/>
+          <w:szCs w:val="24"/>
+        </w:rPr>
+        <w:t>Education &amp; Certifications</w:t>
+      </w:r>
+    </w:p>
+    <w:p>
+      <w:pPr>
+        <w:spacing w:after="0" w:line="240" w:lineRule="auto"/>
+        <w:rPr>
+          <w:rFonts w:ascii="Calibri" w:hAnsi="Calibri" w:cs="Calibri"/>
+          <w:sz w:val="22"/>
+          <w:szCs w:val="22"/>
+          <w:u w:val="single"/>
+        </w:rPr>
+        <w:sectPr>
+          <w:type w:val="continuous"/>
+          <w:pgSz w:w="12240" w:h="15840"/>
+          <w:pgMar w:top="1440" w:right="1440" w:bottom="1440" w:left="1440" w:header="432" w:footer="720" w:gutter="0"/>
+          <w:cols w:space="720"/>
+          <w:docGrid w:linePitch="360"/>
+        </w:sectPr>
+      </w:pPr>
+    </w:p>
+    <w:p>
+      <w:pPr>
+        <w:spacing w:after="0" w:line="240" w:lineRule="auto"/>
+        <w:rPr>
+          <w:rFonts w:ascii="Calibri" w:hAnsi="Calibri" w:cs="Calibri"/>
+          <w:sz w:val="22"/>
+          <w:szCs w:val="22"/>
+        </w:rPr>
+      </w:pPr>
+      <w:r>
+        <w:rPr>
+          <w:rFonts w:ascii="Calibri" w:hAnsi="Calibri" w:cs="Calibri"/>
+          <w:b/>
+          <w:bCs/>
+          <w:sz w:val="22"/>
+          <w:szCs w:val="22"/>
+        </w:rPr>
+        <w:t>Oregon State University</w:t>
+      </w:r>
+      <w:r>
+        <w:rPr>
+          <w:rFonts w:ascii="Calibri" w:hAnsi="Calibri" w:cs="Calibri"/>
+          <w:sz w:val="22"/>
+          <w:szCs w:val="22"/>
+        </w:rPr>
+        <w:t xml:space="preserve"> </w:t>
+      </w:r>
+    </w:p>
+    <w:p>
+      <w:pPr>
+        <w:spacing w:after="80" w:line="240" w:lineRule="auto"/>
+        <w:rPr>
+          <w:rFonts w:ascii="Calibri" w:hAnsi="Calibri" w:cs="Calibri"/>
+          <w:sz w:val="22"/>
+          <w:szCs w:val="22"/>
+        </w:rPr>
+      </w:pPr>
+      <w:r>
+        <w:rPr>
+          <w:rFonts w:ascii="Calibri" w:hAnsi="Calibri" w:cs="Calibri"/>
+          <w:sz w:val="22"/>
+          <w:szCs w:val="22"/>
+        </w:rPr>
+        <w:t xml:space="preserve">Post-Baccalaureate Computer Science (3.9) </w:t>
+      </w:r>
+    </w:p>
+    <w:p>
+      <w:pPr>
+        <w:spacing w:after="0" w:line="240" w:lineRule="auto"/>
+        <w:rPr>
+          <w:rFonts w:ascii="Calibri" w:hAnsi="Calibri" w:cs="Calibri"/>
+          <w:sz w:val="22"/>
+          <w:szCs w:val="22"/>
+        </w:rPr>
+      </w:pPr>
+      <w:r>
+        <w:rPr>
+          <w:rFonts w:ascii="Calibri" w:hAnsi="Calibri" w:cs="Calibri"/>
+          <w:b/>
+          <w:bCs/>
+          <w:sz w:val="22"/>
+          <w:szCs w:val="22"/>
+        </w:rPr>
+        <w:t>Microsoft Certified</w:t>
+      </w:r>
+      <w:r>
+        <w:rPr>
+          <w:rFonts w:ascii="Calibri" w:hAnsi="Calibri" w:cs="Calibri"/>
+          <w:sz w:val="22"/>
+          <w:szCs w:val="22"/>
+        </w:rPr>
+        <w:t xml:space="preserve">: </w:t>
+      </w:r>
+    </w:p>
+    <w:p>
+      <w:pPr>
+        <w:spacing w:after="0"/>
+        <w:rPr>
+          <w:rFonts w:ascii="Calibri" w:hAnsi="Calibri" w:cs="Calibri"/>
+          <w:sz w:val="22"/>
+          <w:szCs w:val="22"/>
+        </w:rPr>
+      </w:pPr>
+      <w:r>
+        <w:rPr>
+          <w:rFonts w:ascii="Calibri" w:hAnsi="Calibri" w:cs="Calibri"/>
+          <w:sz w:val="22"/>
+          <w:szCs w:val="22"/>
+        </w:rPr>
+        <w:t xml:space="preserve">Power BI Data Analyst Associate (DP-300) </w:t>
+      </w:r>
+    </w:p>
+    <w:p>
+      <w:pPr>
+        <w:spacing w:after="0" w:line="240" w:lineRule="auto"/>
+        <w:rPr>
+          <w:rFonts w:ascii="Calibri" w:hAnsi="Calibri" w:cs="Calibri"/>
+          <w:sz w:val="22"/>
+          <w:szCs w:val="22"/>
+        </w:rPr>
+      </w:pPr>
+      <w:r>
+        <w:rPr>
+          <w:rFonts w:ascii="Calibri" w:hAnsi="Calibri" w:cs="Calibri"/>
+          <w:b/>
+          <w:bCs/>
+          <w:sz w:val="22"/>
+          <w:szCs w:val="22"/>
+        </w:rPr>
+        <w:t>University of Florida</w:t>
+      </w:r>
+      <w:r>
+        <w:rPr>
+          <w:rFonts w:ascii="Calibri" w:hAnsi="Calibri" w:cs="Calibri"/>
+          <w:sz w:val="22"/>
+          <w:szCs w:val="22"/>
+        </w:rPr>
+        <w:t xml:space="preserve"> </w:t>
+      </w:r>
+    </w:p>
+    <w:p>
+      <w:pPr>
+        <w:spacing w:after="0" w:line="240" w:lineRule="auto"/>
+        <w:rPr>
+          <w:rFonts w:ascii="Calibri" w:hAnsi="Calibri" w:cs="Calibri"/>
+          <w:sz w:val="22"/>
+          <w:szCs w:val="22"/>
+        </w:rPr>
+      </w:pPr>
+      <w:r>
+        <w:rPr>
+          <w:rFonts w:ascii="Calibri" w:hAnsi="Calibri" w:cs="Calibri"/>
+          <w:sz w:val="22"/>
+          <w:szCs w:val="22"/>
+        </w:rPr>
+        <w:t>M.S. Agronomy (3.</w:t>
+      </w:r>
+      <w:r>
+        <w:rPr>
+          <w:rFonts w:ascii="Calibri" w:hAnsi="Calibri" w:cs="Calibri"/>
+          <w:sz w:val="22"/>
+          <w:szCs w:val="22"/>
+        </w:rPr>
+        <w:t>8</w:t>
+      </w:r>
+      <w:r>
+        <w:rPr>
+          <w:rFonts w:ascii="Calibri" w:hAnsi="Calibri" w:cs="Calibri"/>
+          <w:sz w:val="22"/>
+          <w:szCs w:val="22"/>
+        </w:rPr>
+        <w:t>)</w:t>
+      </w:r>
+    </w:p>
+    <w:p>
+      <w:pPr>
+        <w:spacing w:after="0" w:line="240" w:lineRule="auto"/>
+        <w:rPr>
+          <w:rFonts w:ascii="Calibri" w:hAnsi="Calibri" w:cs="Calibri"/>
+          <w:sz w:val="22"/>
+          <w:szCs w:val="22"/>
+        </w:rPr>
+      </w:pPr>
+      <w:r>
+        <w:rPr>
+          <w:rFonts w:ascii="Calibri" w:hAnsi="Calibri" w:cs="Calibri"/>
+          <w:sz w:val="22"/>
+          <w:szCs w:val="22"/>
+        </w:rPr>
+        <w:t xml:space="preserve">Dual Bachelors: </w:t>
+      </w:r>
+      <w:r>
+        <w:rPr>
+          <w:rFonts w:ascii="Calibri" w:hAnsi="Calibri" w:cs="Calibri"/>
+          <w:sz w:val="22"/>
+          <w:szCs w:val="22"/>
+        </w:rPr>
+        <w:t>BS Botany</w:t>
+      </w:r>
+      <w:r>
+        <w:rPr>
+          <w:rFonts w:ascii="Calibri" w:hAnsi="Calibri" w:cs="Calibri"/>
+          <w:sz w:val="22"/>
+          <w:szCs w:val="22"/>
+        </w:rPr>
+        <w:t xml:space="preserve"> &amp; BA</w:t>
+      </w:r>
+      <w:r>
+        <w:rPr>
+          <w:rFonts w:ascii="Calibri" w:hAnsi="Calibri" w:cs="Calibri"/>
+          <w:sz w:val="22"/>
+          <w:szCs w:val="22"/>
+        </w:rPr>
+        <w:t xml:space="preserve"> East Asian Languages &amp; Literature</w:t>
+      </w:r>
+      <w:r>
+        <w:rPr>
+          <w:rFonts w:ascii="Calibri" w:hAnsi="Calibri" w:cs="Calibri"/>
+          <w:sz w:val="22"/>
+          <w:szCs w:val="22"/>
+        </w:rPr>
+        <w:t xml:space="preserve"> (Mandarin Chinese)</w:t>
+      </w:r>
+    </w:p>
+    <w:p>
+      <w:pPr>
+        <w:spacing w:after="80"/>
+        <w:rPr>
+          <w:rFonts w:ascii="Calibri" w:hAnsi="Calibri" w:cs="Calibri"/>
+          <w:sz w:val="22"/>
+          <w:szCs w:val="22"/>
+        </w:rPr>
+        <w:sectPr>
+          <w:type w:val="continuous"/>
+          <w:pgSz w:w="12240" w:h="15840"/>
+          <w:pgMar w:top="1440" w:right="1440" w:bottom="1440" w:left="1440" w:header="720" w:footer="720" w:gutter="0"/>
+          <w:cols w:num="2" w:space="720"/>
+          <w:docGrid w:linePitch="360"/>
+        </w:sectPr>
+      </w:pPr>
+    </w:p>
+    <w:p>
+      <w:pPr>
+        <w:spacing w:after="80"/>
+        <w:rPr>
+          <w:rFonts w:ascii="Calibri" w:hAnsi="Calibri" w:cs="Calibri"/>
+          <w:sz w:val="22"/>
+          <w:szCs w:val="22"/>
+        </w:rPr>
+      </w:pPr>
+    </w:p>
     <w:sectPr>
-      <w:headerReference w:type="even" r:id="rId7"/>
-      <w:headerReference w:type="default" r:id="rId8"/>
-      <w:footerReference w:type="even" r:id="rId9"/>
-      <w:footerReference w:type="default" r:id="rId10"/>
-      <w:headerReference w:type="first" r:id="rId11"/>
-      <w:footerReference w:type="first" r:id="rId12"/>
+      <w:type w:val="continuous"/>
       <w:pgSz w:w="12240" w:h="15840"/>
       <w:pgMar w:top="1440" w:right="1440" w:bottom="1440" w:left="1440" w:header="720" w:footer="720" w:gutter="0"/>
       <w:cols w:space="720"/>
@@ -1190,39 +1763,175 @@
 <w:hdr xmlns:wpc="http://schemas.microsoft.com/office/word/2010/wordprocessingCanvas" xmlns:cx="http://schemas.microsoft.com/office/drawing/2014/chartex" xmlns:cx1="http://schemas.microsoft.com/office/drawing/2015/9/8/chartex" xmlns:cx2="http://schemas.microsoft.com/office/drawing/2015/10/21/chartex" xmlns:cx3="http://schemas.microsoft.com/office/drawing/2016/5/9/chartex" xmlns:cx4="http://schemas.microsoft.com/office/drawing/2016/5/10/chartex" xmlns:cx5="http://schemas.microsoft.com/office/drawing/2016/5/11/chartex" xmlns:cx6="http://schemas.microsoft.com/office/drawing/2016/5/12/chartex" xmlns:cx7="http://schemas.microsoft.com/office/drawing/2016/5/13/chartex" xmlns:cx8="http://schemas.microsoft.com/office/drawing/2016/5/14/chartex" xmlns:mc="http://schemas.openxmlformats.org/markup-compatibility/2006" xmlns:aink="http://schemas.microsoft.com/office/drawing/2016/ink" xmlns:am3d="http://schemas.microsoft.com/office/drawing/2017/model3d" xmlns:o="urn:schemas-microsoft-com:office:office" xmlns:oel="http://schemas.microsoft.com/office/2019/extlst" xmlns:r="http://schemas.openxmlformats.org/officeDocument/2006/relationships" xmlns:m="http://schemas.openxmlformats.org/officeDocument/2006/math" xmlns:v="urn:schemas-microsoft-com:vml" xmlns:wp14="http://schemas.microsoft.com/office/word/2010/wordprocessingDrawing" xmlns:wp="http://schemas.openxmlformats.org/drawingml/2006/wordprocessingDrawing" xmlns:w10="urn:schemas-microsoft-com:office:word" xmlns:w="http://schemas.openxmlformats.org/wordprocessingml/2006/main" xmlns:w14="http://schemas.microsoft.com/office/word/2010/wordml" xmlns:w15="http://schemas.microsoft.com/office/word/2012/wordml" xmlns:w16cex="http://schemas.microsoft.com/office/word/2018/wordml/cex" xmlns:w16cid="http://schemas.microsoft.com/office/word/2016/wordml/cid" xmlns:w16="http://schemas.microsoft.com/office/word/2018/wordml" xmlns:w16du="http://schemas.microsoft.com/office/word/2023/wordml/word16du" xmlns:w16sdtdh="http://schemas.microsoft.com/office/word/2020/wordml/sdtdatahash" xmlns:w16sdtfl="http://schemas.microsoft.com/office/word/2024/wordml/sdtformatlock" xmlns:w16se="http://schemas.microsoft.com/office/word/2015/wordml/symex" xmlns:wpg="http://schemas.microsoft.com/office/word/2010/wordprocessingGroup" xmlns:wpi="http://schemas.microsoft.com/office/word/2010/wordprocessingInk" xmlns:wne="http://schemas.microsoft.com/office/word/2006/wordml" xmlns:wps="http://schemas.microsoft.com/office/word/2010/wordprocessingShape" mc:Ignorable="w14 w15 w16se w16cid w16 w16cex w16sdtdh w16sdtfl w16du wp14">
   <w:p>
     <w:pPr>
+      <w:tabs>
+        <w:tab w:val="right" w:pos="9360"/>
+      </w:tabs>
       <w:spacing w:after="0"/>
-      <w:jc w:val="center"/>
+      <w:rPr>
+        <w:rFonts w:ascii="Calibri" w:hAnsi="Calibri" w:cs="Calibri"/>
+        <w:b/>
+        <w:bCs/>
+        <w:sz w:val="22"/>
+        <w:szCs w:val="22"/>
+      </w:rPr>
     </w:pPr>
     <w:r>
       <w:rPr>
+        <w:rFonts w:ascii="Calibri" w:hAnsi="Calibri" w:cs="Calibri"/>
         <w:b/>
         <w:bCs/>
-        <w:sz w:val="32"/>
-        <w:szCs w:val="32"/>
+        <w:sz w:val="28"/>
+        <w:szCs w:val="28"/>
       </w:rPr>
       <w:t>Isaac Neibaur</w:t>
     </w:r>
     <w:r>
       <w:rPr>
+        <w:rFonts w:ascii="Calibri" w:hAnsi="Calibri" w:cs="Calibri"/>
         <w:b/>
         <w:bCs/>
-        <w:sz w:val="32"/>
-        <w:szCs w:val="32"/>
+        <w:sz w:val="22"/>
+        <w:szCs w:val="22"/>
+      </w:rPr>
+      <w:tab/>
+    </w:r>
+    <w:r>
+      <w:rPr>
+        <w:rFonts w:ascii="Calibri" w:hAnsi="Calibri" w:cs="Calibri"/>
+        <w:sz w:val="22"/>
+        <w:szCs w:val="22"/>
+      </w:rPr>
+      <w:t>Roswell, GA |</w:t>
+    </w:r>
+    <w:r>
+      <w:rPr>
+        <w:rFonts w:ascii="Calibri" w:hAnsi="Calibri" w:cs="Calibri"/>
+        <w:sz w:val="22"/>
+        <w:szCs w:val="22"/>
+      </w:rPr>
+      <w:t xml:space="preserve"> </w:t>
+    </w:r>
+    <w:hyperlink r:id="rId1" w:history="1">
+      <w:r>
+        <w:rPr>
+          <w:rStyle w:val="Hyperlink"/>
+          <w:rFonts w:ascii="Calibri" w:hAnsi="Calibri" w:cs="Calibri"/>
+          <w:sz w:val="22"/>
+          <w:szCs w:val="22"/>
+        </w:rPr>
+        <w:t>isaac@isaacneibaur.com</w:t>
+      </w:r>
+    </w:hyperlink>
+  </w:p>
+  <w:p>
+    <w:pPr>
+      <w:spacing w:after="80"/>
+      <w:rPr>
+        <w:rFonts w:ascii="Calibri" w:hAnsi="Calibri" w:cs="Calibri"/>
+        <w:sz w:val="22"/>
+        <w:szCs w:val="22"/>
+      </w:rPr>
+    </w:pPr>
+    <w:r>
+      <w:rPr>
+        <w:rFonts w:ascii="Calibri" w:hAnsi="Calibri" w:cs="Calibri"/>
+        <w:sz w:val="22"/>
+        <w:szCs w:val="22"/>
+      </w:rPr>
+      <w:t xml:space="preserve">Portfolio page: </w:t>
+    </w:r>
+    <w:hyperlink r:id="rId2" w:history="1">
+      <w:r>
+        <w:rPr>
+          <w:rStyle w:val="Hyperlink"/>
+          <w:rFonts w:ascii="Calibri" w:hAnsi="Calibri" w:cs="Calibri"/>
+          <w:sz w:val="22"/>
+          <w:szCs w:val="22"/>
+        </w:rPr>
+        <w:t>isaacneibaur.com</w:t>
+      </w:r>
+    </w:hyperlink>
+    <w:r>
+      <w:rPr>
+        <w:rFonts w:ascii="Calibri" w:hAnsi="Calibri" w:cs="Calibri"/>
+        <w:sz w:val="22"/>
+        <w:szCs w:val="22"/>
+      </w:rPr>
+      <w:t xml:space="preserve"> |</w:t>
+    </w:r>
+    <w:r>
+      <w:rPr>
+        <w:rFonts w:ascii="Calibri" w:hAnsi="Calibri" w:cs="Calibri"/>
+        <w:sz w:val="22"/>
+        <w:szCs w:val="22"/>
       </w:rPr>
       <w:t xml:space="preserve"> </w:t>
     </w:r>
     <w:r>
-      <w:t>Roswell, GA</w:t>
+      <w:rPr>
+        <w:rFonts w:ascii="Calibri" w:hAnsi="Calibri" w:cs="Calibri"/>
+        <w:sz w:val="22"/>
+        <w:szCs w:val="22"/>
+      </w:rPr>
+      <w:t xml:space="preserve">Technical blog: </w:t>
     </w:r>
-  </w:p>
-  <w:p>
-    <w:pPr>
-      <w:spacing w:after="0"/>
-      <w:jc w:val="center"/>
-    </w:pPr>
+    <w:hyperlink r:id="rId3" w:history="1">
+      <w:r>
+        <w:rPr>
+          <w:rStyle w:val="Hyperlink"/>
+          <w:rFonts w:ascii="Calibri" w:hAnsi="Calibri" w:cs="Calibri"/>
+          <w:sz w:val="22"/>
+          <w:szCs w:val="22"/>
+        </w:rPr>
+        <w:t>100daydash.blog</w:t>
+      </w:r>
+    </w:hyperlink>
     <w:r>
-      <w:t>hello@isaacneibaur.com</w:t>
+      <w:rPr>
+        <w:rFonts w:ascii="Calibri" w:hAnsi="Calibri" w:cs="Calibri"/>
+        <w:sz w:val="22"/>
+        <w:szCs w:val="22"/>
+      </w:rPr>
+      <w:t xml:space="preserve"> |</w:t>
     </w:r>
+    <w:r>
+      <w:rPr>
+        <w:rFonts w:ascii="Calibri" w:hAnsi="Calibri" w:cs="Calibri"/>
+        <w:sz w:val="22"/>
+        <w:szCs w:val="22"/>
+      </w:rPr>
+      <w:t xml:space="preserve"> </w:t>
+    </w:r>
+    <w:r>
+      <w:rPr>
+        <w:rFonts w:ascii="Calibri" w:hAnsi="Calibri" w:cs="Calibri"/>
+        <w:sz w:val="22"/>
+        <w:szCs w:val="22"/>
+      </w:rPr>
+      <w:t xml:space="preserve">Personal repo: </w:t>
+    </w:r>
+    <w:hyperlink r:id="rId4" w:history="1">
+      <w:r>
+        <w:rPr>
+          <w:rStyle w:val="Hyperlink"/>
+          <w:rFonts w:ascii="Calibri" w:hAnsi="Calibri" w:cs="Calibri"/>
+          <w:sz w:val="22"/>
+          <w:szCs w:val="22"/>
+        </w:rPr>
+        <w:t>github.com/</w:t>
+      </w:r>
+      <w:proofErr w:type="spellStart"/>
+      <w:r>
+        <w:rPr>
+          <w:rStyle w:val="Hyperlink"/>
+          <w:rFonts w:ascii="Calibri" w:hAnsi="Calibri" w:cs="Calibri"/>
+          <w:sz w:val="22"/>
+          <w:szCs w:val="22"/>
+        </w:rPr>
+        <w:t>neibaur</w:t>
+      </w:r>
+      <w:proofErr w:type="spellEnd"/>
+    </w:hyperlink>
   </w:p>
 </w:hdr>
 </file>
@@ -1962,6 +2671,7 @@
   <w:style w:type="character" w:default="1" w:styleId="DefaultParagraphFont">
     <w:name w:val="Default Paragraph Font"/>
     <w:uiPriority w:val="1"/>
+    <w:semiHidden/>
     <w:unhideWhenUsed/>
   </w:style>
   <w:style w:type="table" w:default="1" w:styleId="TableNormal">
@@ -2351,6 +3061,18 @@
     <w:rsid w:val="003A47E2"/>
     <w:rPr>
       <w:rFonts w:ascii="Times New Roman" w:hAnsi="Times New Roman" w:cs="Angsana New"/>
+    </w:rPr>
+  </w:style>
+  <w:style w:type="character" w:styleId="FollowedHyperlink">
+    <w:name w:val="FollowedHyperlink"/>
+    <w:basedOn w:val="DefaultParagraphFont"/>
+    <w:uiPriority w:val="99"/>
+    <w:semiHidden/>
+    <w:unhideWhenUsed/>
+    <w:rsid w:val="00251515"/>
+    <w:rPr>
+      <w:color w:val="96607D" w:themeColor="followedHyperlink"/>
+      <w:u w:val="single"/>
     </w:rPr>
   </w:style>
 </w:styles>

</xml_diff>